<commit_message>
feat: route properties, connector filters, route chaining, fan-out, docs update
- Route default properties: key-value pairs injected into messages before filter chain
- Connector filter type: mid-chain HTTP/MLLP outbound calls with response in properties
- Route chaining: next_route_id forwards messages through multiple route filter chains
- Conditional fan-out: per-CP condition scripts gate delivery
- Fix V8 JS transform test: engine returns full output envelope from filter chain
- Fix tunnel-broker missing fmt import
- Update all documentation (API, User Guide, Deployment, Architecture, README)
- Regenerate .docx files
- Schema migration 009: default_properties, next_route_id on routes
- 35/35 tests passing
</commit_message>
<xml_diff>
--- a/docs/Arteria-Console-User-Guide.docx
+++ b/docs/Arteria-Console-User-Guide.docx
@@ -10,7 +10,7 @@
         <w:t xml:space="preserve">Arteria Console User Guide</w:t>
       </w:r>
     </w:p>
-    <w:bookmarkStart w:id="45" w:name="arteria-console-user-guide"/>
+    <w:bookmarkStart w:id="54" w:name="arteria-console-user-guide"/>
     <w:p>
       <w:pPr>
         <w:pStyle w:val="Heading1"/>
@@ -866,7 +866,7 @@
     </w:p>
     <w:bookmarkEnd w:id="15"/>
     <w:bookmarkEnd w:id="16"/>
-    <w:bookmarkStart w:id="20" w:name="routes"/>
+    <w:bookmarkStart w:id="23" w:name="routes"/>
     <w:p>
       <w:pPr>
         <w:pStyle w:val="Heading2"/>
@@ -901,7 +901,7 @@
         <w:pStyle w:val="BodyText"/>
       </w:pPr>
       <w:r>
-        <w:t xml:space="preserve">This is the core configuration screen — equivalent to Rhapsody’s Route Editor. The page has three panels.</w:t>
+        <w:t xml:space="preserve">This is the core configuration screen — the Route Editor. The page has three panels.</w:t>
       </w:r>
     </w:p>
     <w:bookmarkStart w:id="17" w:name="left-panel-route-list"/>
@@ -1654,6 +1654,1130 @@
       </w:r>
       <w:r>
         <w:t xml:space="preserve">buttons</w:t>
+      </w:r>
+    </w:p>
+    <w:p>
+      <w:pPr>
+        <w:pStyle w:val="BodyText"/>
+      </w:pPr>
+      <w:r>
+        <w:rPr>
+          <w:b/>
+          <w:bCs/>
+        </w:rPr>
+        <w:t xml:space="preserve">Filter Types:</w:t>
+      </w:r>
+    </w:p>
+    <w:tbl>
+      <w:tblPr>
+        <w:tblStyle w:val="Table"/>
+        <w:tblW w:type="pct" w:w="5000"/>
+        <w:tblLayout w:type="fixed"/>
+        <w:tblLook w:firstRow="1" w:lastRow="0" w:firstColumn="0" w:lastColumn="0" w:noHBand="0" w:noVBand="0" w:val="0020"/>
+      </w:tblPr>
+      <w:tblGrid>
+        <w:gridCol w:w="1532"/>
+        <w:gridCol w:w="3065"/>
+        <w:gridCol w:w="3321"/>
+      </w:tblGrid>
+      <w:tr>
+        <w:trPr>
+          <w:tblHeader w:val="on"/>
+        </w:trPr>
+        <w:tc>
+          <w:tcPr/>
+          <w:p>
+            <w:pPr>
+              <w:pStyle w:val="Compact"/>
+            </w:pPr>
+            <w:r>
+              <w:t xml:space="preserve">Type</w:t>
+            </w:r>
+          </w:p>
+        </w:tc>
+        <w:tc>
+          <w:tcPr/>
+          <w:p>
+            <w:pPr>
+              <w:pStyle w:val="Compact"/>
+            </w:pPr>
+            <w:r>
+              <w:t xml:space="preserve">Entry Point</w:t>
+            </w:r>
+          </w:p>
+        </w:tc>
+        <w:tc>
+          <w:tcPr/>
+          <w:p>
+            <w:pPr>
+              <w:pStyle w:val="Compact"/>
+            </w:pPr>
+            <w:r>
+              <w:t xml:space="preserve">Description</w:t>
+            </w:r>
+          </w:p>
+        </w:tc>
+      </w:tr>
+      <w:tr>
+        <w:tc>
+          <w:tcPr/>
+          <w:p>
+            <w:pPr>
+              <w:pStyle w:val="Compact"/>
+            </w:pPr>
+            <w:r>
+              <w:rPr>
+                <w:rStyle w:val="VerbatimChar"/>
+              </w:rPr>
+              <w:t xml:space="preserve">javascript</w:t>
+            </w:r>
+          </w:p>
+        </w:tc>
+        <w:tc>
+          <w:tcPr/>
+          <w:p>
+            <w:pPr>
+              <w:pStyle w:val="Compact"/>
+            </w:pPr>
+            <w:r>
+              <w:rPr>
+                <w:rStyle w:val="VerbatimChar"/>
+              </w:rPr>
+              <w:t xml:space="preserve">transform(msg)</w:t>
+            </w:r>
+            <w:r>
+              <w:t xml:space="preserve"> </w:t>
+            </w:r>
+            <w:r>
+              <w:t xml:space="preserve">in V8</w:t>
+            </w:r>
+          </w:p>
+        </w:tc>
+        <w:tc>
+          <w:tcPr/>
+          <w:p>
+            <w:pPr>
+              <w:pStyle w:val="Compact"/>
+            </w:pPr>
+            <w:r>
+              <w:t xml:space="preserve">Modify message and return it. Native V8 speed (~1ms). 50ms timeout.</w:t>
+            </w:r>
+          </w:p>
+        </w:tc>
+      </w:tr>
+      <w:tr>
+        <w:tc>
+          <w:tcPr/>
+          <w:p>
+            <w:pPr>
+              <w:pStyle w:val="Compact"/>
+            </w:pPr>
+            <w:r>
+              <w:rPr>
+                <w:rStyle w:val="VerbatimChar"/>
+              </w:rPr>
+              <w:t xml:space="preserve">conditional</w:t>
+            </w:r>
+          </w:p>
+        </w:tc>
+        <w:tc>
+          <w:tcPr/>
+          <w:p>
+            <w:pPr>
+              <w:pStyle w:val="Compact"/>
+            </w:pPr>
+            <w:r>
+              <w:rPr>
+                <w:rStyle w:val="VerbatimChar"/>
+              </w:rPr>
+              <w:t xml:space="preserve">evaluate(msg)</w:t>
+            </w:r>
+            <w:r>
+              <w:t xml:space="preserve"> </w:t>
+            </w:r>
+            <w:r>
+              <w:t xml:space="preserve">in V8</w:t>
+            </w:r>
+          </w:p>
+        </w:tc>
+        <w:tc>
+          <w:tcPr/>
+          <w:p>
+            <w:pPr>
+              <w:pStyle w:val="Compact"/>
+            </w:pPr>
+            <w:r>
+              <w:t xml:space="preserve">Return routing decisions. 50ms timeout.</w:t>
+            </w:r>
+          </w:p>
+        </w:tc>
+      </w:tr>
+      <w:tr>
+        <w:tc>
+          <w:tcPr/>
+          <w:p>
+            <w:pPr>
+              <w:pStyle w:val="Compact"/>
+            </w:pPr>
+            <w:r>
+              <w:rPr>
+                <w:rStyle w:val="VerbatimChar"/>
+              </w:rPr>
+              <w:t xml:space="preserve">lookup</w:t>
+            </w:r>
+          </w:p>
+        </w:tc>
+        <w:tc>
+          <w:tcPr/>
+          <w:p>
+            <w:pPr>
+              <w:pStyle w:val="Compact"/>
+            </w:pPr>
+            <w:r>
+              <w:t xml:space="preserve">—</w:t>
+            </w:r>
+          </w:p>
+        </w:tc>
+        <w:tc>
+          <w:tcPr/>
+          <w:p>
+            <w:pPr>
+              <w:pStyle w:val="Compact"/>
+            </w:pPr>
+            <w:r>
+              <w:t xml:space="preserve">Enriches message from a lookup table (configured via</w:t>
+            </w:r>
+            <w:r>
+              <w:t xml:space="preserve"> </w:t>
+            </w:r>
+            <w:r>
+              <w:rPr>
+                <w:rStyle w:val="VerbatimChar"/>
+              </w:rPr>
+              <w:t xml:space="preserve">config_json</w:t>
+            </w:r>
+            <w:r>
+              <w:t xml:space="preserve">)</w:t>
+            </w:r>
+          </w:p>
+        </w:tc>
+      </w:tr>
+      <w:tr>
+        <w:tc>
+          <w:tcPr/>
+          <w:p>
+            <w:pPr>
+              <w:pStyle w:val="Compact"/>
+            </w:pPr>
+            <w:r>
+              <w:rPr>
+                <w:rStyle w:val="VerbatimChar"/>
+              </w:rPr>
+              <w:t xml:space="preserve">python</w:t>
+            </w:r>
+          </w:p>
+        </w:tc>
+        <w:tc>
+          <w:tcPr/>
+          <w:p>
+            <w:pPr>
+              <w:pStyle w:val="Compact"/>
+            </w:pPr>
+            <w:r>
+              <w:t xml:space="preserve">Script via stdin/stdout</w:t>
+            </w:r>
+          </w:p>
+        </w:tc>
+        <w:tc>
+          <w:tcPr/>
+          <w:p>
+            <w:pPr>
+              <w:pStyle w:val="Compact"/>
+            </w:pPr>
+            <w:r>
+              <w:t xml:space="preserve">Full Python3 — reads envelope JSON from stdin, writes modified envelope to stdout. 2s timeout.</w:t>
+            </w:r>
+          </w:p>
+        </w:tc>
+      </w:tr>
+      <w:tr>
+        <w:tc>
+          <w:tcPr/>
+          <w:p>
+            <w:pPr>
+              <w:pStyle w:val="Compact"/>
+            </w:pPr>
+            <w:r>
+              <w:rPr>
+                <w:rStyle w:val="VerbatimChar"/>
+              </w:rPr>
+              <w:t xml:space="preserve">bash</w:t>
+            </w:r>
+          </w:p>
+        </w:tc>
+        <w:tc>
+          <w:tcPr/>
+          <w:p>
+            <w:pPr>
+              <w:pStyle w:val="Compact"/>
+            </w:pPr>
+            <w:r>
+              <w:t xml:space="preserve">Script via stdin/stdout</w:t>
+            </w:r>
+          </w:p>
+        </w:tc>
+        <w:tc>
+          <w:tcPr/>
+          <w:p>
+            <w:pPr>
+              <w:pStyle w:val="Compact"/>
+            </w:pPr>
+            <w:r>
+              <w:t xml:space="preserve">Bash script — same stdin/stdout contract. 2s timeout.</w:t>
+            </w:r>
+          </w:p>
+        </w:tc>
+      </w:tr>
+      <w:tr>
+        <w:tc>
+          <w:tcPr/>
+          <w:p>
+            <w:pPr>
+              <w:pStyle w:val="Compact"/>
+            </w:pPr>
+            <w:r>
+              <w:rPr>
+                <w:rStyle w:val="VerbatimChar"/>
+              </w:rPr>
+              <w:t xml:space="preserve">dotnet</w:t>
+            </w:r>
+          </w:p>
+        </w:tc>
+        <w:tc>
+          <w:tcPr/>
+          <w:p>
+            <w:pPr>
+              <w:pStyle w:val="Compact"/>
+            </w:pPr>
+            <w:r>
+              <w:rPr>
+                <w:rStyle w:val="VerbatimChar"/>
+              </w:rPr>
+              <w:t xml:space="preserve">dotnet-script eval</w:t>
+            </w:r>
+          </w:p>
+        </w:tc>
+        <w:tc>
+          <w:tcPr/>
+          <w:p>
+            <w:pPr>
+              <w:pStyle w:val="Compact"/>
+            </w:pPr>
+            <w:r>
+              <w:t xml:space="preserve">C# via dotnet-script — same stdin/stdout contract. 10s timeout (JIT cold-start).</w:t>
+            </w:r>
+          </w:p>
+        </w:tc>
+      </w:tr>
+      <w:tr>
+        <w:tc>
+          <w:tcPr/>
+          <w:p>
+            <w:pPr>
+              <w:pStyle w:val="Compact"/>
+            </w:pPr>
+            <w:r>
+              <w:rPr>
+                <w:rStyle w:val="VerbatimChar"/>
+              </w:rPr>
+              <w:t xml:space="preserve">connector</w:t>
+            </w:r>
+          </w:p>
+        </w:tc>
+        <w:tc>
+          <w:tcPr/>
+          <w:p>
+            <w:pPr>
+              <w:pStyle w:val="Compact"/>
+            </w:pPr>
+            <w:r>
+              <w:t xml:space="preserve">—</w:t>
+            </w:r>
+          </w:p>
+        </w:tc>
+        <w:tc>
+          <w:tcPr/>
+          <w:p>
+            <w:pPr>
+              <w:pStyle w:val="Compact"/>
+            </w:pPr>
+            <w:r>
+              <w:t xml:space="preserve">Makes an outbound HTTP or MLLP call mid-chain and stores the response in message properties.</w:t>
+            </w:r>
+          </w:p>
+        </w:tc>
+      </w:tr>
+    </w:tbl>
+    <w:p>
+      <w:pPr>
+        <w:pStyle w:val="BodyText"/>
+      </w:pPr>
+      <w:r>
+        <w:rPr>
+          <w:b/>
+          <w:bCs/>
+        </w:rPr>
+        <w:t xml:space="preserve">Writing a Python Filter:</w:t>
+      </w:r>
+    </w:p>
+    <w:p>
+      <w:pPr>
+        <w:pStyle w:val="SourceCode"/>
+      </w:pPr>
+      <w:r>
+        <w:rPr>
+          <w:rStyle w:val="ImportTok"/>
+        </w:rPr>
+        <w:t xml:space="preserve">import</w:t>
+      </w:r>
+      <w:r>
+        <w:rPr>
+          <w:rStyle w:val="NormalTok"/>
+        </w:rPr>
+        <w:t xml:space="preserve"> sys, json</w:t>
+      </w:r>
+      <w:r>
+        <w:br/>
+      </w:r>
+      <w:r>
+        <w:br/>
+      </w:r>
+      <w:r>
+        <w:rPr>
+          <w:rStyle w:val="NormalTok"/>
+        </w:rPr>
+        <w:t xml:space="preserve">envelope </w:t>
+      </w:r>
+      <w:r>
+        <w:rPr>
+          <w:rStyle w:val="OperatorTok"/>
+        </w:rPr>
+        <w:t xml:space="preserve">=</w:t>
+      </w:r>
+      <w:r>
+        <w:rPr>
+          <w:rStyle w:val="NormalTok"/>
+        </w:rPr>
+        <w:t xml:space="preserve"> json.loads(sys.stdin.read())</w:t>
+      </w:r>
+      <w:r>
+        <w:br/>
+      </w:r>
+      <w:r>
+        <w:rPr>
+          <w:rStyle w:val="CommentTok"/>
+        </w:rPr>
+        <w:t xml:space="preserve"># Modify the envelope</w:t>
+      </w:r>
+      <w:r>
+        <w:br/>
+      </w:r>
+      <w:r>
+        <w:rPr>
+          <w:rStyle w:val="NormalTok"/>
+        </w:rPr>
+        <w:t xml:space="preserve">envelope[</w:t>
+      </w:r>
+      <w:r>
+        <w:rPr>
+          <w:rStyle w:val="StringTok"/>
+        </w:rPr>
+        <w:t xml:space="preserve">"properties"</w:t>
+      </w:r>
+      <w:r>
+        <w:rPr>
+          <w:rStyle w:val="NormalTok"/>
+        </w:rPr>
+        <w:t xml:space="preserve">][</w:t>
+      </w:r>
+      <w:r>
+        <w:rPr>
+          <w:rStyle w:val="StringTok"/>
+        </w:rPr>
+        <w:t xml:space="preserve">"processed_by"</w:t>
+      </w:r>
+      <w:r>
+        <w:rPr>
+          <w:rStyle w:val="NormalTok"/>
+        </w:rPr>
+        <w:t xml:space="preserve">] </w:t>
+      </w:r>
+      <w:r>
+        <w:rPr>
+          <w:rStyle w:val="OperatorTok"/>
+        </w:rPr>
+        <w:t xml:space="preserve">=</w:t>
+      </w:r>
+      <w:r>
+        <w:rPr>
+          <w:rStyle w:val="NormalTok"/>
+        </w:rPr>
+        <w:t xml:space="preserve"> </w:t>
+      </w:r>
+      <w:r>
+        <w:rPr>
+          <w:rStyle w:val="StringTok"/>
+        </w:rPr>
+        <w:t xml:space="preserve">"python"</w:t>
+      </w:r>
+      <w:r>
+        <w:br/>
+      </w:r>
+      <w:r>
+        <w:rPr>
+          <w:rStyle w:val="CommentTok"/>
+        </w:rPr>
+        <w:t xml:space="preserve"># Write back to stdout</w:t>
+      </w:r>
+      <w:r>
+        <w:br/>
+      </w:r>
+      <w:r>
+        <w:rPr>
+          <w:rStyle w:val="NormalTok"/>
+        </w:rPr>
+        <w:t xml:space="preserve">json.dump(envelope, sys.stdout)</w:t>
+      </w:r>
+    </w:p>
+    <w:p>
+      <w:pPr>
+        <w:pStyle w:val="FirstParagraph"/>
+      </w:pPr>
+      <w:r>
+        <w:rPr>
+          <w:b/>
+          <w:bCs/>
+        </w:rPr>
+        <w:t xml:space="preserve">Writing a .NET/C# Filter:</w:t>
+      </w:r>
+    </w:p>
+    <w:p>
+      <w:pPr>
+        <w:pStyle w:val="SourceCode"/>
+      </w:pPr>
+      <w:r>
+        <w:rPr>
+          <w:rStyle w:val="KeywordTok"/>
+        </w:rPr>
+        <w:t xml:space="preserve">using</w:t>
+      </w:r>
+      <w:r>
+        <w:rPr>
+          <w:rStyle w:val="NormalTok"/>
+        </w:rPr>
+        <w:t xml:space="preserve"> System</w:t>
+      </w:r>
+      <w:r>
+        <w:rPr>
+          <w:rStyle w:val="OperatorTok"/>
+        </w:rPr>
+        <w:t xml:space="preserve">;</w:t>
+      </w:r>
+      <w:r>
+        <w:br/>
+      </w:r>
+      <w:r>
+        <w:rPr>
+          <w:rStyle w:val="KeywordTok"/>
+        </w:rPr>
+        <w:t xml:space="preserve">using</w:t>
+      </w:r>
+      <w:r>
+        <w:rPr>
+          <w:rStyle w:val="NormalTok"/>
+        </w:rPr>
+        <w:t xml:space="preserve"> System</w:t>
+      </w:r>
+      <w:r>
+        <w:rPr>
+          <w:rStyle w:val="OperatorTok"/>
+        </w:rPr>
+        <w:t xml:space="preserve">.</w:t>
+      </w:r>
+      <w:r>
+        <w:rPr>
+          <w:rStyle w:val="FunctionTok"/>
+        </w:rPr>
+        <w:t xml:space="preserve">Text</w:t>
+      </w:r>
+      <w:r>
+        <w:rPr>
+          <w:rStyle w:val="OperatorTok"/>
+        </w:rPr>
+        <w:t xml:space="preserve">.</w:t>
+      </w:r>
+      <w:r>
+        <w:rPr>
+          <w:rStyle w:val="FunctionTok"/>
+        </w:rPr>
+        <w:t xml:space="preserve">Json</w:t>
+      </w:r>
+      <w:r>
+        <w:rPr>
+          <w:rStyle w:val="OperatorTok"/>
+        </w:rPr>
+        <w:t xml:space="preserve">;</w:t>
+      </w:r>
+      <w:r>
+        <w:br/>
+      </w:r>
+      <w:r>
+        <w:br/>
+      </w:r>
+      <w:r>
+        <w:rPr>
+          <w:rStyle w:val="DataTypeTok"/>
+        </w:rPr>
+        <w:t xml:space="preserve">var</w:t>
+      </w:r>
+      <w:r>
+        <w:rPr>
+          <w:rStyle w:val="NormalTok"/>
+        </w:rPr>
+        <w:t xml:space="preserve"> input </w:t>
+      </w:r>
+      <w:r>
+        <w:rPr>
+          <w:rStyle w:val="OperatorTok"/>
+        </w:rPr>
+        <w:t xml:space="preserve">=</w:t>
+      </w:r>
+      <w:r>
+        <w:rPr>
+          <w:rStyle w:val="NormalTok"/>
+        </w:rPr>
+        <w:t xml:space="preserve"> Console</w:t>
+      </w:r>
+      <w:r>
+        <w:rPr>
+          <w:rStyle w:val="OperatorTok"/>
+        </w:rPr>
+        <w:t xml:space="preserve">.</w:t>
+      </w:r>
+      <w:r>
+        <w:rPr>
+          <w:rStyle w:val="FunctionTok"/>
+        </w:rPr>
+        <w:t xml:space="preserve">In</w:t>
+      </w:r>
+      <w:r>
+        <w:rPr>
+          <w:rStyle w:val="OperatorTok"/>
+        </w:rPr>
+        <w:t xml:space="preserve">.</w:t>
+      </w:r>
+      <w:r>
+        <w:rPr>
+          <w:rStyle w:val="FunctionTok"/>
+        </w:rPr>
+        <w:t xml:space="preserve">ReadToEnd</w:t>
+      </w:r>
+      <w:r>
+        <w:rPr>
+          <w:rStyle w:val="OperatorTok"/>
+        </w:rPr>
+        <w:t xml:space="preserve">();</w:t>
+      </w:r>
+      <w:r>
+        <w:br/>
+      </w:r>
+      <w:r>
+        <w:rPr>
+          <w:rStyle w:val="DataTypeTok"/>
+        </w:rPr>
+        <w:t xml:space="preserve">var</w:t>
+      </w:r>
+      <w:r>
+        <w:rPr>
+          <w:rStyle w:val="NormalTok"/>
+        </w:rPr>
+        <w:t xml:space="preserve"> doc </w:t>
+      </w:r>
+      <w:r>
+        <w:rPr>
+          <w:rStyle w:val="OperatorTok"/>
+        </w:rPr>
+        <w:t xml:space="preserve">=</w:t>
+      </w:r>
+      <w:r>
+        <w:rPr>
+          <w:rStyle w:val="NormalTok"/>
+        </w:rPr>
+        <w:t xml:space="preserve"> JsonDocument</w:t>
+      </w:r>
+      <w:r>
+        <w:rPr>
+          <w:rStyle w:val="OperatorTok"/>
+        </w:rPr>
+        <w:t xml:space="preserve">.</w:t>
+      </w:r>
+      <w:r>
+        <w:rPr>
+          <w:rStyle w:val="FunctionTok"/>
+        </w:rPr>
+        <w:t xml:space="preserve">Parse</w:t>
+      </w:r>
+      <w:r>
+        <w:rPr>
+          <w:rStyle w:val="OperatorTok"/>
+        </w:rPr>
+        <w:t xml:space="preserve">(</w:t>
+      </w:r>
+      <w:r>
+        <w:rPr>
+          <w:rStyle w:val="NormalTok"/>
+        </w:rPr>
+        <w:t xml:space="preserve">input</w:t>
+      </w:r>
+      <w:r>
+        <w:rPr>
+          <w:rStyle w:val="OperatorTok"/>
+        </w:rPr>
+        <w:t xml:space="preserve">);</w:t>
+      </w:r>
+      <w:r>
+        <w:br/>
+      </w:r>
+      <w:r>
+        <w:rPr>
+          <w:rStyle w:val="CommentTok"/>
+        </w:rPr>
+        <w:t xml:space="preserve">// ... modify and output</w:t>
+      </w:r>
+      <w:r>
+        <w:br/>
+      </w:r>
+      <w:r>
+        <w:rPr>
+          <w:rStyle w:val="NormalTok"/>
+        </w:rPr>
+        <w:t xml:space="preserve">Console</w:t>
+      </w:r>
+      <w:r>
+        <w:rPr>
+          <w:rStyle w:val="OperatorTok"/>
+        </w:rPr>
+        <w:t xml:space="preserve">.</w:t>
+      </w:r>
+      <w:r>
+        <w:rPr>
+          <w:rStyle w:val="FunctionTok"/>
+        </w:rPr>
+        <w:t xml:space="preserve">Write</w:t>
+      </w:r>
+      <w:r>
+        <w:rPr>
+          <w:rStyle w:val="OperatorTok"/>
+        </w:rPr>
+        <w:t xml:space="preserve">(</w:t>
+      </w:r>
+      <w:r>
+        <w:rPr>
+          <w:rStyle w:val="NormalTok"/>
+        </w:rPr>
+        <w:t xml:space="preserve">modifiedJson</w:t>
+      </w:r>
+      <w:r>
+        <w:rPr>
+          <w:rStyle w:val="OperatorTok"/>
+        </w:rPr>
+        <w:t xml:space="preserve">);</w:t>
+      </w:r>
+    </w:p>
+    <w:p>
+      <w:pPr>
+        <w:pStyle w:val="FirstParagraph"/>
+      </w:pPr>
+      <w:r>
+        <w:rPr>
+          <w:b/>
+          <w:bCs/>
+        </w:rPr>
+        <w:t xml:space="preserve">Connector Filter (mid-chain outbound call):</w:t>
+      </w:r>
+    </w:p>
+    <w:p>
+      <w:pPr>
+        <w:pStyle w:val="BodyText"/>
+      </w:pPr>
+      <w:r>
+        <w:t xml:space="preserve">A connector filter makes an HTTP or MLLP call during processing and stores the response in message properties. Configure via</w:t>
+      </w:r>
+      <w:r>
+        <w:t xml:space="preserve"> </w:t>
+      </w:r>
+      <w:r>
+        <w:rPr>
+          <w:rStyle w:val="VerbatimChar"/>
+        </w:rPr>
+        <w:t xml:space="preserve">config_json</w:t>
+      </w:r>
+      <w:r>
+        <w:t xml:space="preserve">:</w:t>
+      </w:r>
+    </w:p>
+    <w:p>
+      <w:pPr>
+        <w:pStyle w:val="SourceCode"/>
+      </w:pPr>
+      <w:r>
+        <w:rPr>
+          <w:rStyle w:val="FunctionTok"/>
+        </w:rPr>
+        <w:t xml:space="preserve">{</w:t>
+      </w:r>
+      <w:r>
+        <w:br/>
+      </w:r>
+      <w:r>
+        <w:rPr>
+          <w:rStyle w:val="NormalTok"/>
+        </w:rPr>
+        <w:t xml:space="preserve">  </w:t>
+      </w:r>
+      <w:r>
+        <w:rPr>
+          <w:rStyle w:val="DataTypeTok"/>
+        </w:rPr>
+        <w:t xml:space="preserve">"connector_type"</w:t>
+      </w:r>
+      <w:r>
+        <w:rPr>
+          <w:rStyle w:val="FunctionTok"/>
+        </w:rPr>
+        <w:t xml:space="preserve">:</w:t>
+      </w:r>
+      <w:r>
+        <w:rPr>
+          <w:rStyle w:val="NormalTok"/>
+        </w:rPr>
+        <w:t xml:space="preserve"> </w:t>
+      </w:r>
+      <w:r>
+        <w:rPr>
+          <w:rStyle w:val="StringTok"/>
+        </w:rPr>
+        <w:t xml:space="preserve">"HTTP"</w:t>
+      </w:r>
+      <w:r>
+        <w:rPr>
+          <w:rStyle w:val="FunctionTok"/>
+        </w:rPr>
+        <w:t xml:space="preserve">,</w:t>
+      </w:r>
+      <w:r>
+        <w:br/>
+      </w:r>
+      <w:r>
+        <w:rPr>
+          <w:rStyle w:val="NormalTok"/>
+        </w:rPr>
+        <w:t xml:space="preserve">  </w:t>
+      </w:r>
+      <w:r>
+        <w:rPr>
+          <w:rStyle w:val="DataTypeTok"/>
+        </w:rPr>
+        <w:t xml:space="preserve">"url"</w:t>
+      </w:r>
+      <w:r>
+        <w:rPr>
+          <w:rStyle w:val="FunctionTok"/>
+        </w:rPr>
+        <w:t xml:space="preserve">:</w:t>
+      </w:r>
+      <w:r>
+        <w:rPr>
+          <w:rStyle w:val="NormalTok"/>
+        </w:rPr>
+        <w:t xml:space="preserve"> </w:t>
+      </w:r>
+      <w:r>
+        <w:rPr>
+          <w:rStyle w:val="StringTok"/>
+        </w:rPr>
+        <w:t xml:space="preserve">"https://api.example.com/lookup"</w:t>
+      </w:r>
+      <w:r>
+        <w:rPr>
+          <w:rStyle w:val="FunctionTok"/>
+        </w:rPr>
+        <w:t xml:space="preserve">,</w:t>
+      </w:r>
+      <w:r>
+        <w:br/>
+      </w:r>
+      <w:r>
+        <w:rPr>
+          <w:rStyle w:val="NormalTok"/>
+        </w:rPr>
+        <w:t xml:space="preserve">  </w:t>
+      </w:r>
+      <w:r>
+        <w:rPr>
+          <w:rStyle w:val="DataTypeTok"/>
+        </w:rPr>
+        <w:t xml:space="preserve">"method"</w:t>
+      </w:r>
+      <w:r>
+        <w:rPr>
+          <w:rStyle w:val="FunctionTok"/>
+        </w:rPr>
+        <w:t xml:space="preserve">:</w:t>
+      </w:r>
+      <w:r>
+        <w:rPr>
+          <w:rStyle w:val="NormalTok"/>
+        </w:rPr>
+        <w:t xml:space="preserve"> </w:t>
+      </w:r>
+      <w:r>
+        <w:rPr>
+          <w:rStyle w:val="StringTok"/>
+        </w:rPr>
+        <w:t xml:space="preserve">"POST"</w:t>
+      </w:r>
+      <w:r>
+        <w:rPr>
+          <w:rStyle w:val="FunctionTok"/>
+        </w:rPr>
+        <w:t xml:space="preserve">,</w:t>
+      </w:r>
+      <w:r>
+        <w:br/>
+      </w:r>
+      <w:r>
+        <w:rPr>
+          <w:rStyle w:val="NormalTok"/>
+        </w:rPr>
+        <w:t xml:space="preserve">  </w:t>
+      </w:r>
+      <w:r>
+        <w:rPr>
+          <w:rStyle w:val="DataTypeTok"/>
+        </w:rPr>
+        <w:t xml:space="preserve">"headers"</w:t>
+      </w:r>
+      <w:r>
+        <w:rPr>
+          <w:rStyle w:val="FunctionTok"/>
+        </w:rPr>
+        <w:t xml:space="preserve">:</w:t>
+      </w:r>
+      <w:r>
+        <w:rPr>
+          <w:rStyle w:val="NormalTok"/>
+        </w:rPr>
+        <w:t xml:space="preserve"> </w:t>
+      </w:r>
+      <w:r>
+        <w:rPr>
+          <w:rStyle w:val="FunctionTok"/>
+        </w:rPr>
+        <w:t xml:space="preserve">{</w:t>
+      </w:r>
+      <w:r>
+        <w:rPr>
+          <w:rStyle w:val="DataTypeTok"/>
+        </w:rPr>
+        <w:t xml:space="preserve">"Authorization"</w:t>
+      </w:r>
+      <w:r>
+        <w:rPr>
+          <w:rStyle w:val="FunctionTok"/>
+        </w:rPr>
+        <w:t xml:space="preserve">:</w:t>
+      </w:r>
+      <w:r>
+        <w:rPr>
+          <w:rStyle w:val="NormalTok"/>
+        </w:rPr>
+        <w:t xml:space="preserve"> </w:t>
+      </w:r>
+      <w:r>
+        <w:rPr>
+          <w:rStyle w:val="StringTok"/>
+        </w:rPr>
+        <w:t xml:space="preserve">"Bearer token"</w:t>
+      </w:r>
+      <w:r>
+        <w:rPr>
+          <w:rStyle w:val="FunctionTok"/>
+        </w:rPr>
+        <w:t xml:space="preserve">},</w:t>
+      </w:r>
+      <w:r>
+        <w:br/>
+      </w:r>
+      <w:r>
+        <w:rPr>
+          <w:rStyle w:val="NormalTok"/>
+        </w:rPr>
+        <w:t xml:space="preserve">  </w:t>
+      </w:r>
+      <w:r>
+        <w:rPr>
+          <w:rStyle w:val="DataTypeTok"/>
+        </w:rPr>
+        <w:t xml:space="preserve">"timeout_ms"</w:t>
+      </w:r>
+      <w:r>
+        <w:rPr>
+          <w:rStyle w:val="FunctionTok"/>
+        </w:rPr>
+        <w:t xml:space="preserve">:</w:t>
+      </w:r>
+      <w:r>
+        <w:rPr>
+          <w:rStyle w:val="NormalTok"/>
+        </w:rPr>
+        <w:t xml:space="preserve"> </w:t>
+      </w:r>
+      <w:r>
+        <w:rPr>
+          <w:rStyle w:val="DecValTok"/>
+        </w:rPr>
+        <w:t xml:space="preserve">5000</w:t>
+      </w:r>
+      <w:r>
+        <w:rPr>
+          <w:rStyle w:val="FunctionTok"/>
+        </w:rPr>
+        <w:t xml:space="preserve">,</w:t>
+      </w:r>
+      <w:r>
+        <w:br/>
+      </w:r>
+      <w:r>
+        <w:rPr>
+          <w:rStyle w:val="NormalTok"/>
+        </w:rPr>
+        <w:t xml:space="preserve">  </w:t>
+      </w:r>
+      <w:r>
+        <w:rPr>
+          <w:rStyle w:val="DataTypeTok"/>
+        </w:rPr>
+        <w:t xml:space="preserve">"response_property"</w:t>
+      </w:r>
+      <w:r>
+        <w:rPr>
+          <w:rStyle w:val="FunctionTok"/>
+        </w:rPr>
+        <w:t xml:space="preserve">:</w:t>
+      </w:r>
+      <w:r>
+        <w:rPr>
+          <w:rStyle w:val="NormalTok"/>
+        </w:rPr>
+        <w:t xml:space="preserve"> </w:t>
+      </w:r>
+      <w:r>
+        <w:rPr>
+          <w:rStyle w:val="StringTok"/>
+        </w:rPr>
+        <w:t xml:space="preserve">"api_response"</w:t>
+      </w:r>
+      <w:r>
+        <w:rPr>
+          <w:rStyle w:val="FunctionTok"/>
+        </w:rPr>
+        <w:t xml:space="preserve">,</w:t>
+      </w:r>
+      <w:r>
+        <w:br/>
+      </w:r>
+      <w:r>
+        <w:rPr>
+          <w:rStyle w:val="NormalTok"/>
+        </w:rPr>
+        <w:t xml:space="preserve">  </w:t>
+      </w:r>
+      <w:r>
+        <w:rPr>
+          <w:rStyle w:val="DataTypeTok"/>
+        </w:rPr>
+        <w:t xml:space="preserve">"response_status_property"</w:t>
+      </w:r>
+      <w:r>
+        <w:rPr>
+          <w:rStyle w:val="FunctionTok"/>
+        </w:rPr>
+        <w:t xml:space="preserve">:</w:t>
+      </w:r>
+      <w:r>
+        <w:rPr>
+          <w:rStyle w:val="NormalTok"/>
+        </w:rPr>
+        <w:t xml:space="preserve"> </w:t>
+      </w:r>
+      <w:r>
+        <w:rPr>
+          <w:rStyle w:val="StringTok"/>
+        </w:rPr>
+        <w:t xml:space="preserve">"api_status"</w:t>
+      </w:r>
+      <w:r>
+        <w:br/>
+      </w:r>
+      <w:r>
+        <w:rPr>
+          <w:rStyle w:val="FunctionTok"/>
+        </w:rPr>
+        <w:t xml:space="preserve">}</w:t>
+      </w:r>
+    </w:p>
+    <w:p>
+      <w:pPr>
+        <w:pStyle w:val="FirstParagraph"/>
+      </w:pPr>
+      <w:r>
+        <w:t xml:space="preserve">After the connector runs, subsequent filters can read</w:t>
+      </w:r>
+      <w:r>
+        <w:t xml:space="preserve"> </w:t>
+      </w:r>
+      <w:r>
+        <w:rPr>
+          <w:rStyle w:val="VerbatimChar"/>
+        </w:rPr>
+        <w:t xml:space="preserve">msg.properties.api_response</w:t>
+      </w:r>
+      <w:r>
+        <w:t xml:space="preserve"> </w:t>
+      </w:r>
+      <w:r>
+        <w:t xml:space="preserve">and</w:t>
+      </w:r>
+      <w:r>
+        <w:t xml:space="preserve"> </w:t>
+      </w:r>
+      <w:r>
+        <w:rPr>
+          <w:rStyle w:val="VerbatimChar"/>
+        </w:rPr>
+        <w:t xml:space="preserve">msg.properties.api_status</w:t>
+      </w:r>
+      <w:r>
+        <w:t xml:space="preserve">.</w:t>
+      </w:r>
+    </w:p>
+    <w:p>
+      <w:pPr>
+        <w:pStyle w:val="BodyText"/>
+      </w:pPr>
+      <w:r>
+        <w:t xml:space="preserve">For MLLP connectors, the ACK code (AA/AE/AR) is automatically extracted from the MSA segment and stored in the status property.</w:t>
       </w:r>
     </w:p>
     <w:p>
@@ -2803,25 +3927,196 @@
         <w:t xml:space="preserve"> </w:t>
       </w:r>
       <w:r>
-        <w:t xml:space="preserve">Each filter has a 50ms execution limit. If your script takes longer, the message is rejected with a timeout error.</w:t>
-      </w:r>
-    </w:p>
-    <w:p>
-      <w:r>
-        <w:pict>
-          <v:rect style="width:0;height:1.5pt" o:hralign="center" o:hrstd="t" o:hr="t"/>
-        </w:pict>
+        <w:t xml:space="preserve">JavaScript filters have a 50ms execution limit. Python/bash filters have a 2s limit. .NET filters have a 10s limit (for JIT cold-start). If a script takes longer, the message is rejected with a timeout error.</w:t>
       </w:r>
     </w:p>
     <w:bookmarkEnd w:id="19"/>
+    <w:bookmarkStart w:id="20" w:name="route-properties"/>
+    <w:p>
+      <w:pPr>
+        <w:pStyle w:val="Heading3"/>
+      </w:pPr>
+      <w:r>
+        <w:t xml:space="preserve">Route Properties</w:t>
+      </w:r>
+    </w:p>
+    <w:p>
+      <w:pPr>
+        <w:pStyle w:val="FirstParagraph"/>
+      </w:pPr>
+      <w:r>
+        <w:t xml:space="preserve">Routes can have</w:t>
+      </w:r>
+      <w:r>
+        <w:t xml:space="preserve"> </w:t>
+      </w:r>
+      <w:r>
+        <w:rPr>
+          <w:b/>
+          <w:bCs/>
+        </w:rPr>
+        <w:t xml:space="preserve">default properties</w:t>
+      </w:r>
+      <w:r>
+        <w:t xml:space="preserve"> </w:t>
+      </w:r>
+      <w:r>
+        <w:t xml:space="preserve">— key-value pairs that are injected into every message before the filter chain runs. Use the API to set them:</w:t>
+      </w:r>
+    </w:p>
+    <w:p>
+      <w:pPr>
+        <w:pStyle w:val="SourceCode"/>
+      </w:pPr>
+      <w:r>
+        <w:rPr>
+          <w:rStyle w:val="ExtensionTok"/>
+        </w:rPr>
+        <w:t xml:space="preserve">curl</w:t>
+      </w:r>
+      <w:r>
+        <w:rPr>
+          <w:rStyle w:val="NormalTok"/>
+        </w:rPr>
+        <w:t xml:space="preserve"> </w:t>
+      </w:r>
+      <w:r>
+        <w:rPr>
+          <w:rStyle w:val="AttributeTok"/>
+        </w:rPr>
+        <w:t xml:space="preserve">-X</w:t>
+      </w:r>
+      <w:r>
+        <w:rPr>
+          <w:rStyle w:val="NormalTok"/>
+        </w:rPr>
+        <w:t xml:space="preserve"> PUT http://localhost:8080/api/v1/routes/</w:t>
+      </w:r>
+      <w:r>
+        <w:rPr>
+          <w:rStyle w:val="OperatorTok"/>
+        </w:rPr>
+        <w:t xml:space="preserve">&lt;</w:t>
+      </w:r>
+      <w:r>
+        <w:rPr>
+          <w:rStyle w:val="NormalTok"/>
+        </w:rPr>
+        <w:t xml:space="preserve">route-id</w:t>
+      </w:r>
+      <w:r>
+        <w:rPr>
+          <w:rStyle w:val="OperatorTok"/>
+        </w:rPr>
+        <w:t xml:space="preserve">&gt;</w:t>
+      </w:r>
+      <w:r>
+        <w:rPr>
+          <w:rStyle w:val="NormalTok"/>
+        </w:rPr>
+        <w:t xml:space="preserve">/properties </w:t>
+      </w:r>
+      <w:r>
+        <w:rPr>
+          <w:rStyle w:val="DataTypeTok"/>
+        </w:rPr>
+        <w:t xml:space="preserve">\</w:t>
+      </w:r>
+      <w:r>
+        <w:br/>
+      </w:r>
+      <w:r>
+        <w:rPr>
+          <w:rStyle w:val="NormalTok"/>
+        </w:rPr>
+        <w:t xml:space="preserve">  </w:t>
+      </w:r>
+      <w:r>
+        <w:rPr>
+          <w:rStyle w:val="AttributeTok"/>
+        </w:rPr>
+        <w:t xml:space="preserve">-H</w:t>
+      </w:r>
+      <w:r>
+        <w:rPr>
+          <w:rStyle w:val="NormalTok"/>
+        </w:rPr>
+        <w:t xml:space="preserve"> </w:t>
+      </w:r>
+      <w:r>
+        <w:rPr>
+          <w:rStyle w:val="StringTok"/>
+        </w:rPr>
+        <w:t xml:space="preserve">'Content-Type: application/json'</w:t>
+      </w:r>
+      <w:r>
+        <w:rPr>
+          <w:rStyle w:val="NormalTok"/>
+        </w:rPr>
+        <w:t xml:space="preserve"> </w:t>
+      </w:r>
+      <w:r>
+        <w:rPr>
+          <w:rStyle w:val="DataTypeTok"/>
+        </w:rPr>
+        <w:t xml:space="preserve">\</w:t>
+      </w:r>
+      <w:r>
+        <w:br/>
+      </w:r>
+      <w:r>
+        <w:rPr>
+          <w:rStyle w:val="NormalTok"/>
+        </w:rPr>
+        <w:t xml:space="preserve">  </w:t>
+      </w:r>
+      <w:r>
+        <w:rPr>
+          <w:rStyle w:val="AttributeTok"/>
+        </w:rPr>
+        <w:t xml:space="preserve">-d</w:t>
+      </w:r>
+      <w:r>
+        <w:rPr>
+          <w:rStyle w:val="NormalTok"/>
+        </w:rPr>
+        <w:t xml:space="preserve"> </w:t>
+      </w:r>
+      <w:r>
+        <w:rPr>
+          <w:rStyle w:val="StringTok"/>
+        </w:rPr>
+        <w:t xml:space="preserve">'{"properties": {"environment": "production", "source_system": "hospital_a"}}'</w:t>
+      </w:r>
+    </w:p>
+    <w:p>
+      <w:pPr>
+        <w:pStyle w:val="FirstParagraph"/>
+      </w:pPr>
+      <w:r>
+        <w:t xml:space="preserve">Filters can then read these via</w:t>
+      </w:r>
+      <w:r>
+        <w:t xml:space="preserve"> </w:t>
+      </w:r>
+      <w:r>
+        <w:rPr>
+          <w:rStyle w:val="VerbatimChar"/>
+        </w:rPr>
+        <w:t xml:space="preserve">msg.properties.environment</w:t>
+      </w:r>
+      <w:r>
+        <w:t xml:space="preserve">, modify them, or add new ones. Properties persist through the entire filter chain and are stored in the database for audit.</w:t>
+      </w:r>
+    </w:p>
     <w:bookmarkEnd w:id="20"/>
-    <w:bookmarkStart w:id="23" w:name="communication-points"/>
-    <w:p>
-      <w:pPr>
-        <w:pStyle w:val="Heading2"/>
-      </w:pPr>
-      <w:r>
-        <w:t xml:space="preserve">4. Communication Points</w:t>
+    <w:bookmarkStart w:id="21" w:name="route-chaining"/>
+    <w:p>
+      <w:pPr>
+        <w:pStyle w:val="Heading3"/>
+      </w:pPr>
+      <w:r>
+        <w:t xml:space="preserve">Route Chaining</w:t>
       </w:r>
     </w:p>
     <w:p>
@@ -2829,20 +4124,7 @@
         <w:pStyle w:val="FirstParagraph"/>
       </w:pPr>
       <w:r>
-        <w:rPr>
-          <w:b/>
-          <w:bCs/>
-        </w:rPr>
-        <w:t xml:space="preserve">URL:</w:t>
-      </w:r>
-      <w:r>
-        <w:t xml:space="preserve"> </w:t>
-      </w:r>
-      <w:r>
-        <w:rPr>
-          <w:rStyle w:val="VerbatimChar"/>
-        </w:rPr>
-        <w:t xml:space="preserve">/comm-points</w:t>
+        <w:t xml:space="preserve">Routes can be chained so that after one route’s filter chain completes, the message is forwarded to another route’s filter chain. This enables complex multi-stage processing:</w:t>
       </w:r>
     </w:p>
     <w:p>
@@ -2850,16 +4132,168 @@
         <w:pStyle w:val="BodyText"/>
       </w:pPr>
       <w:r>
-        <w:t xml:space="preserve">Communication points define how Arteria connects to external systems — equivalent to Rhapsody Communication Points.</w:t>
-      </w:r>
-    </w:p>
-    <w:bookmarkStart w:id="21" w:name="left-panel-cp-list"/>
+        <w:rPr>
+          <w:b/>
+          <w:bCs/>
+        </w:rPr>
+        <w:t xml:space="preserve">Example scenario:</w:t>
+      </w:r>
+      <w:r>
+        <w:t xml:space="preserve"> </w:t>
+      </w:r>
+      <w:r>
+        <w:t xml:space="preserve">HL7 received → call HTTP API for enrichment → enrich the HL7 → send to MLLP endpoint → check the ACK → if failed, route to email CP.</w:t>
+      </w:r>
+    </w:p>
+    <w:p>
+      <w:pPr>
+        <w:pStyle w:val="BodyText"/>
+      </w:pPr>
+      <w:r>
+        <w:t xml:space="preserve">Set up chaining via the API:</w:t>
+      </w:r>
+    </w:p>
+    <w:p>
+      <w:pPr>
+        <w:pStyle w:val="SourceCode"/>
+      </w:pPr>
+      <w:r>
+        <w:rPr>
+          <w:rStyle w:val="ExtensionTok"/>
+        </w:rPr>
+        <w:t xml:space="preserve">curl</w:t>
+      </w:r>
+      <w:r>
+        <w:rPr>
+          <w:rStyle w:val="NormalTok"/>
+        </w:rPr>
+        <w:t xml:space="preserve"> </w:t>
+      </w:r>
+      <w:r>
+        <w:rPr>
+          <w:rStyle w:val="AttributeTok"/>
+        </w:rPr>
+        <w:t xml:space="preserve">-X</w:t>
+      </w:r>
+      <w:r>
+        <w:rPr>
+          <w:rStyle w:val="NormalTok"/>
+        </w:rPr>
+        <w:t xml:space="preserve"> PUT http://localhost:8080/api/v1/routes/</w:t>
+      </w:r>
+      <w:r>
+        <w:rPr>
+          <w:rStyle w:val="OperatorTok"/>
+        </w:rPr>
+        <w:t xml:space="preserve">&lt;</w:t>
+      </w:r>
+      <w:r>
+        <w:rPr>
+          <w:rStyle w:val="NormalTok"/>
+        </w:rPr>
+        <w:t xml:space="preserve">route-id</w:t>
+      </w:r>
+      <w:r>
+        <w:rPr>
+          <w:rStyle w:val="OperatorTok"/>
+        </w:rPr>
+        <w:t xml:space="preserve">&gt;</w:t>
+      </w:r>
+      <w:r>
+        <w:rPr>
+          <w:rStyle w:val="NormalTok"/>
+        </w:rPr>
+        <w:t xml:space="preserve">/chain </w:t>
+      </w:r>
+      <w:r>
+        <w:rPr>
+          <w:rStyle w:val="DataTypeTok"/>
+        </w:rPr>
+        <w:t xml:space="preserve">\</w:t>
+      </w:r>
+      <w:r>
+        <w:br/>
+      </w:r>
+      <w:r>
+        <w:rPr>
+          <w:rStyle w:val="NormalTok"/>
+        </w:rPr>
+        <w:t xml:space="preserve">  </w:t>
+      </w:r>
+      <w:r>
+        <w:rPr>
+          <w:rStyle w:val="AttributeTok"/>
+        </w:rPr>
+        <w:t xml:space="preserve">-H</w:t>
+      </w:r>
+      <w:r>
+        <w:rPr>
+          <w:rStyle w:val="NormalTok"/>
+        </w:rPr>
+        <w:t xml:space="preserve"> </w:t>
+      </w:r>
+      <w:r>
+        <w:rPr>
+          <w:rStyle w:val="StringTok"/>
+        </w:rPr>
+        <w:t xml:space="preserve">'Content-Type: application/json'</w:t>
+      </w:r>
+      <w:r>
+        <w:rPr>
+          <w:rStyle w:val="NormalTok"/>
+        </w:rPr>
+        <w:t xml:space="preserve"> </w:t>
+      </w:r>
+      <w:r>
+        <w:rPr>
+          <w:rStyle w:val="DataTypeTok"/>
+        </w:rPr>
+        <w:t xml:space="preserve">\</w:t>
+      </w:r>
+      <w:r>
+        <w:br/>
+      </w:r>
+      <w:r>
+        <w:rPr>
+          <w:rStyle w:val="NormalTok"/>
+        </w:rPr>
+        <w:t xml:space="preserve">  </w:t>
+      </w:r>
+      <w:r>
+        <w:rPr>
+          <w:rStyle w:val="AttributeTok"/>
+        </w:rPr>
+        <w:t xml:space="preserve">-d</w:t>
+      </w:r>
+      <w:r>
+        <w:rPr>
+          <w:rStyle w:val="NormalTok"/>
+        </w:rPr>
+        <w:t xml:space="preserve"> </w:t>
+      </w:r>
+      <w:r>
+        <w:rPr>
+          <w:rStyle w:val="StringTok"/>
+        </w:rPr>
+        <w:t xml:space="preserve">'{"next_route_id": "&lt;next-route-uuid&gt;"}'</w:t>
+      </w:r>
+    </w:p>
+    <w:p>
+      <w:pPr>
+        <w:pStyle w:val="FirstParagraph"/>
+      </w:pPr>
+      <w:r>
+        <w:t xml:space="preserve">Maximum chain depth is 10 to prevent infinite loops.</w:t>
+      </w:r>
+    </w:p>
+    <w:bookmarkEnd w:id="21"/>
+    <w:bookmarkStart w:id="22" w:name="fan-out"/>
     <w:p>
       <w:pPr>
         <w:pStyle w:val="Heading3"/>
       </w:pPr>
       <w:r>
-        <w:t xml:space="preserve">Left Panel — CP List</w:t>
+        <w:t xml:space="preserve">Fan-Out</w:t>
       </w:r>
     </w:p>
     <w:p>
@@ -2867,140 +4301,388 @@
         <w:pStyle w:val="FirstParagraph"/>
       </w:pPr>
       <w:r>
-        <w:t xml:space="preserve">Shows all configured CPs as cards with:</w:t>
-      </w:r>
-      <w:r>
-        <w:t xml:space="preserve"> </w:t>
-      </w:r>
-      <w:r>
-        <w:t xml:space="preserve">- Active status indicator (green dot = running, grey = stopped)</w:t>
-      </w:r>
-      <w:r>
-        <w:t xml:space="preserve"> </w:t>
-      </w:r>
-      <w:r>
-        <w:t xml:space="preserve">- Direction badge:</w:t>
-      </w:r>
-      <w:r>
-        <w:t xml:space="preserve"> </w:t>
-      </w:r>
-      <w:r>
-        <w:rPr>
-          <w:b/>
-          <w:bCs/>
-        </w:rPr>
-        <w:t xml:space="preserve">INPUT</w:t>
-      </w:r>
-      <w:r>
-        <w:t xml:space="preserve"> </w:t>
-      </w:r>
-      <w:r>
-        <w:t xml:space="preserve">(blue) or</w:t>
-      </w:r>
-      <w:r>
-        <w:t xml:space="preserve"> </w:t>
-      </w:r>
-      <w:r>
-        <w:rPr>
-          <w:b/>
-          <w:bCs/>
-        </w:rPr>
-        <w:t xml:space="preserve">OUTPUT</w:t>
-      </w:r>
-      <w:r>
-        <w:t xml:space="preserve"> </w:t>
-      </w:r>
-      <w:r>
-        <w:t xml:space="preserve">(purple)</w:t>
-      </w:r>
-      <w:r>
-        <w:t xml:space="preserve"> </w:t>
-      </w:r>
-      <w:r>
-        <w:t xml:space="preserve">- Protocol, address (host:port), retry config</w:t>
-      </w:r>
-      <w:r>
-        <w:t xml:space="preserve"> </w:t>
-      </w:r>
-      <w:r>
-        <w:t xml:space="preserve">-</w:t>
-      </w:r>
-      <w:r>
-        <w:t xml:space="preserve"> </w:t>
-      </w:r>
-      <w:r>
-        <w:rPr>
-          <w:b/>
-          <w:bCs/>
-        </w:rPr>
-        <w:t xml:space="preserve">Edit</w:t>
-      </w:r>
-      <w:r>
-        <w:t xml:space="preserve"> </w:t>
-      </w:r>
-      <w:r>
-        <w:t xml:space="preserve">and</w:t>
-      </w:r>
-      <w:r>
-        <w:t xml:space="preserve"> </w:t>
-      </w:r>
-      <w:r>
-        <w:rPr>
-          <w:b/>
-          <w:bCs/>
-        </w:rPr>
-        <w:t xml:space="preserve">Del</w:t>
-      </w:r>
-      <w:r>
-        <w:t xml:space="preserve"> </w:t>
-      </w:r>
-      <w:r>
-        <w:t xml:space="preserve">actions</w:t>
-      </w:r>
-    </w:p>
-    <w:p>
-      <w:pPr>
-        <w:pStyle w:val="BodyText"/>
-      </w:pPr>
-      <w:r>
-        <w:rPr>
-          <w:b/>
-          <w:bCs/>
-        </w:rPr>
-        <w:t xml:space="preserve">Creating a new communication point:</w:t>
-      </w:r>
-    </w:p>
-    <w:p>
-      <w:pPr>
-        <w:pStyle w:val="Compact"/>
+        <w:t xml:space="preserve">A route can deliver messages to multiple output CPs simultaneously:</w:t>
+      </w:r>
+    </w:p>
+    <w:p>
+      <w:pPr>
         <w:numPr>
           <w:ilvl w:val="0"/>
           <w:numId w:val="1006"/>
         </w:numPr>
       </w:pPr>
       <w:r>
-        <w:t xml:space="preserve">Click</w:t>
-      </w:r>
-      <w:r>
-        <w:t xml:space="preserve"> </w:t>
-      </w:r>
-      <w:r>
-        <w:rPr>
-          <w:b/>
-          <w:bCs/>
-        </w:rPr>
-        <w:t xml:space="preserve">+ New Comm Point</w:t>
-      </w:r>
-    </w:p>
-    <w:p>
-      <w:pPr>
-        <w:pStyle w:val="Compact"/>
+        <w:rPr>
+          <w:b/>
+          <w:bCs/>
+        </w:rPr>
+        <w:t xml:space="preserve">Simple fan-out</w:t>
+      </w:r>
+      <w:r>
+        <w:t xml:space="preserve">: Set</w:t>
+      </w:r>
+      <w:r>
+        <w:t xml:space="preserve"> </w:t>
+      </w:r>
+      <w:r>
+        <w:rPr>
+          <w:rStyle w:val="VerbatimChar"/>
+        </w:rPr>
+        <w:t xml:space="preserve">fan_out_cp_ids</w:t>
+      </w:r>
+      <w:r>
+        <w:t xml:space="preserve"> </w:t>
+      </w:r>
+      <w:r>
+        <w:t xml:space="preserve">on the route to add additional output CPs. Every message goes to all of them plus the primary destination.</w:t>
+      </w:r>
+    </w:p>
+    <w:p>
+      <w:pPr>
         <w:numPr>
           <w:ilvl w:val="0"/>
           <w:numId w:val="1006"/>
         </w:numPr>
       </w:pPr>
       <w:r>
+        <w:rPr>
+          <w:b/>
+          <w:bCs/>
+        </w:rPr>
+        <w:t xml:space="preserve">Conditional fan-out</w:t>
+      </w:r>
+      <w:r>
+        <w:t xml:space="preserve">: Configure per-CP condition scripts that evaluate whether each CP should receive the message. For example, send lab orders to radiology only if the message contains a radiology order code.</w:t>
+      </w:r>
+    </w:p>
+    <w:p>
+      <w:pPr>
+        <w:pStyle w:val="FirstParagraph"/>
+      </w:pPr>
+      <w:r>
+        <w:t xml:space="preserve">Configure via the API:</w:t>
+      </w:r>
+    </w:p>
+    <w:p>
+      <w:pPr>
+        <w:pStyle w:val="SourceCode"/>
+      </w:pPr>
+      <w:r>
+        <w:rPr>
+          <w:rStyle w:val="ExtensionTok"/>
+        </w:rPr>
+        <w:t xml:space="preserve">curl</w:t>
+      </w:r>
+      <w:r>
+        <w:rPr>
+          <w:rStyle w:val="NormalTok"/>
+        </w:rPr>
+        <w:t xml:space="preserve"> </w:t>
+      </w:r>
+      <w:r>
+        <w:rPr>
+          <w:rStyle w:val="AttributeTok"/>
+        </w:rPr>
+        <w:t xml:space="preserve">-X</w:t>
+      </w:r>
+      <w:r>
+        <w:rPr>
+          <w:rStyle w:val="NormalTok"/>
+        </w:rPr>
+        <w:t xml:space="preserve"> PUT http://localhost:8080/api/v1/routes/</w:t>
+      </w:r>
+      <w:r>
+        <w:rPr>
+          <w:rStyle w:val="OperatorTok"/>
+        </w:rPr>
+        <w:t xml:space="preserve">&lt;</w:t>
+      </w:r>
+      <w:r>
+        <w:rPr>
+          <w:rStyle w:val="NormalTok"/>
+        </w:rPr>
+        <w:t xml:space="preserve">route-id</w:t>
+      </w:r>
+      <w:r>
+        <w:rPr>
+          <w:rStyle w:val="OperatorTok"/>
+        </w:rPr>
+        <w:t xml:space="preserve">&gt;</w:t>
+      </w:r>
+      <w:r>
+        <w:rPr>
+          <w:rStyle w:val="NormalTok"/>
+        </w:rPr>
+        <w:t xml:space="preserve">/fan-out </w:t>
+      </w:r>
+      <w:r>
+        <w:rPr>
+          <w:rStyle w:val="DataTypeTok"/>
+        </w:rPr>
+        <w:t xml:space="preserve">\</w:t>
+      </w:r>
+      <w:r>
+        <w:br/>
+      </w:r>
+      <w:r>
+        <w:rPr>
+          <w:rStyle w:val="NormalTok"/>
+        </w:rPr>
+        <w:t xml:space="preserve">  </w:t>
+      </w:r>
+      <w:r>
+        <w:rPr>
+          <w:rStyle w:val="AttributeTok"/>
+        </w:rPr>
+        <w:t xml:space="preserve">-H</w:t>
+      </w:r>
+      <w:r>
+        <w:rPr>
+          <w:rStyle w:val="NormalTok"/>
+        </w:rPr>
+        <w:t xml:space="preserve"> </w:t>
+      </w:r>
+      <w:r>
+        <w:rPr>
+          <w:rStyle w:val="StringTok"/>
+        </w:rPr>
+        <w:t xml:space="preserve">'Content-Type: application/json'</w:t>
+      </w:r>
+      <w:r>
+        <w:rPr>
+          <w:rStyle w:val="NormalTok"/>
+        </w:rPr>
+        <w:t xml:space="preserve"> </w:t>
+      </w:r>
+      <w:r>
+        <w:rPr>
+          <w:rStyle w:val="DataTypeTok"/>
+        </w:rPr>
+        <w:t xml:space="preserve">\</w:t>
+      </w:r>
+      <w:r>
+        <w:br/>
+      </w:r>
+      <w:r>
+        <w:rPr>
+          <w:rStyle w:val="NormalTok"/>
+        </w:rPr>
+        <w:t xml:space="preserve">  </w:t>
+      </w:r>
+      <w:r>
+        <w:rPr>
+          <w:rStyle w:val="AttributeTok"/>
+        </w:rPr>
+        <w:t xml:space="preserve">-d</w:t>
+      </w:r>
+      <w:r>
+        <w:rPr>
+          <w:rStyle w:val="NormalTok"/>
+        </w:rPr>
+        <w:t xml:space="preserve"> </w:t>
+      </w:r>
+      <w:r>
+        <w:rPr>
+          <w:rStyle w:val="StringTok"/>
+        </w:rPr>
+        <w:t xml:space="preserve">'{"entries": [{"cp_id": "uuid", "name": "Radiology", "condition_type": "python", "condition": "import sys,json; e=json.loads(sys.stdin.read()); print(\"true\" if \"RAD\" in e[\"rawPayload\"] else \"false\")"}]}'</w:t>
+      </w:r>
+    </w:p>
+    <w:p>
+      <w:r>
+        <w:pict>
+          <v:rect style="width:0;height:1.5pt" o:hralign="center" o:hrstd="t" o:hr="t"/>
+        </w:pict>
+      </w:r>
+    </w:p>
+    <w:bookmarkEnd w:id="22"/>
+    <w:bookmarkEnd w:id="23"/>
+    <w:bookmarkStart w:id="27" w:name="communication-points"/>
+    <w:p>
+      <w:pPr>
+        <w:pStyle w:val="Heading2"/>
+      </w:pPr>
+      <w:r>
+        <w:t xml:space="preserve">4. Communication Points</w:t>
+      </w:r>
+    </w:p>
+    <w:p>
+      <w:pPr>
+        <w:pStyle w:val="FirstParagraph"/>
+      </w:pPr>
+      <w:r>
+        <w:rPr>
+          <w:b/>
+          <w:bCs/>
+        </w:rPr>
+        <w:t xml:space="preserve">URL:</w:t>
+      </w:r>
+      <w:r>
+        <w:t xml:space="preserve"> </w:t>
+      </w:r>
+      <w:r>
+        <w:rPr>
+          <w:rStyle w:val="VerbatimChar"/>
+        </w:rPr>
+        <w:t xml:space="preserve">/comm-points</w:t>
+      </w:r>
+    </w:p>
+    <w:p>
+      <w:pPr>
+        <w:pStyle w:val="BodyText"/>
+      </w:pPr>
+      <w:r>
+        <w:t xml:space="preserve">Communication points define how Arteria connects to external systems.</w:t>
+      </w:r>
+    </w:p>
+    <w:bookmarkStart w:id="24" w:name="left-panel-cp-list"/>
+    <w:p>
+      <w:pPr>
+        <w:pStyle w:val="Heading3"/>
+      </w:pPr>
+      <w:r>
+        <w:t xml:space="preserve">Left Panel — CP List</w:t>
+      </w:r>
+    </w:p>
+    <w:p>
+      <w:pPr>
+        <w:pStyle w:val="FirstParagraph"/>
+      </w:pPr>
+      <w:r>
+        <w:t xml:space="preserve">Shows all configured CPs as cards with:</w:t>
+      </w:r>
+      <w:r>
+        <w:t xml:space="preserve"> </w:t>
+      </w:r>
+      <w:r>
+        <w:t xml:space="preserve">- Active status indicator (green dot = running, grey = stopped)</w:t>
+      </w:r>
+      <w:r>
+        <w:t xml:space="preserve"> </w:t>
+      </w:r>
+      <w:r>
+        <w:t xml:space="preserve">- Direction badge:</w:t>
+      </w:r>
+      <w:r>
+        <w:t xml:space="preserve"> </w:t>
+      </w:r>
+      <w:r>
+        <w:rPr>
+          <w:b/>
+          <w:bCs/>
+        </w:rPr>
+        <w:t xml:space="preserve">INPUT</w:t>
+      </w:r>
+      <w:r>
+        <w:t xml:space="preserve"> </w:t>
+      </w:r>
+      <w:r>
+        <w:t xml:space="preserve">(blue) or</w:t>
+      </w:r>
+      <w:r>
+        <w:t xml:space="preserve"> </w:t>
+      </w:r>
+      <w:r>
+        <w:rPr>
+          <w:b/>
+          <w:bCs/>
+        </w:rPr>
+        <w:t xml:space="preserve">OUTPUT</w:t>
+      </w:r>
+      <w:r>
+        <w:t xml:space="preserve"> </w:t>
+      </w:r>
+      <w:r>
+        <w:t xml:space="preserve">(purple)</w:t>
+      </w:r>
+      <w:r>
+        <w:t xml:space="preserve"> </w:t>
+      </w:r>
+      <w:r>
+        <w:t xml:space="preserve">- Protocol, address (host:port), retry config</w:t>
+      </w:r>
+      <w:r>
+        <w:t xml:space="preserve"> </w:t>
+      </w:r>
+      <w:r>
+        <w:t xml:space="preserve">-</w:t>
+      </w:r>
+      <w:r>
+        <w:t xml:space="preserve"> </w:t>
+      </w:r>
+      <w:r>
+        <w:rPr>
+          <w:b/>
+          <w:bCs/>
+        </w:rPr>
+        <w:t xml:space="preserve">Edit</w:t>
+      </w:r>
+      <w:r>
+        <w:t xml:space="preserve"> </w:t>
+      </w:r>
+      <w:r>
+        <w:t xml:space="preserve">and</w:t>
+      </w:r>
+      <w:r>
+        <w:t xml:space="preserve"> </w:t>
+      </w:r>
+      <w:r>
+        <w:rPr>
+          <w:b/>
+          <w:bCs/>
+        </w:rPr>
+        <w:t xml:space="preserve">Del</w:t>
+      </w:r>
+      <w:r>
+        <w:t xml:space="preserve"> </w:t>
+      </w:r>
+      <w:r>
+        <w:t xml:space="preserve">actions</w:t>
+      </w:r>
+    </w:p>
+    <w:p>
+      <w:pPr>
+        <w:pStyle w:val="BodyText"/>
+      </w:pPr>
+      <w:r>
+        <w:rPr>
+          <w:b/>
+          <w:bCs/>
+        </w:rPr>
+        <w:t xml:space="preserve">Creating a new communication point:</w:t>
+      </w:r>
+    </w:p>
+    <w:p>
+      <w:pPr>
+        <w:pStyle w:val="Compact"/>
+        <w:numPr>
+          <w:ilvl w:val="0"/>
+          <w:numId w:val="1007"/>
+        </w:numPr>
+      </w:pPr>
+      <w:r>
+        <w:t xml:space="preserve">Click</w:t>
+      </w:r>
+      <w:r>
+        <w:t xml:space="preserve"> </w:t>
+      </w:r>
+      <w:r>
+        <w:rPr>
+          <w:b/>
+          <w:bCs/>
+        </w:rPr>
+        <w:t xml:space="preserve">+ New Comm Point</w:t>
+      </w:r>
+    </w:p>
+    <w:p>
+      <w:pPr>
+        <w:pStyle w:val="Compact"/>
+        <w:numPr>
+          <w:ilvl w:val="0"/>
+          <w:numId w:val="1007"/>
+        </w:numPr>
+      </w:pPr>
+      <w:r>
         <w:t xml:space="preserve">Fill in the form:</w:t>
       </w:r>
     </w:p>
@@ -3009,7 +4691,7 @@
         <w:pStyle w:val="Compact"/>
         <w:numPr>
           <w:ilvl w:val="1"/>
-          <w:numId w:val="1007"/>
+          <w:numId w:val="1008"/>
         </w:numPr>
       </w:pPr>
       <w:r>
@@ -3040,7 +4722,7 @@
         <w:pStyle w:val="Compact"/>
         <w:numPr>
           <w:ilvl w:val="1"/>
-          <w:numId w:val="1007"/>
+          <w:numId w:val="1008"/>
         </w:numPr>
       </w:pPr>
       <w:r>
@@ -3062,7 +4744,7 @@
         <w:pStyle w:val="Compact"/>
         <w:numPr>
           <w:ilvl w:val="1"/>
-          <w:numId w:val="1007"/>
+          <w:numId w:val="1008"/>
         </w:numPr>
       </w:pPr>
       <w:r>
@@ -3076,7 +4758,7 @@
         <w:t xml:space="preserve"> </w:t>
       </w:r>
       <w:r>
-        <w:t xml:space="preserve">— MLLP, HTTP, TCP, or REST</w:t>
+        <w:t xml:space="preserve">— MLLP, HTTP, TCP, REST, or cloud connectors (S3, Azure Blob, SQS, SNS, Event Hub, Service Bus, Webhook)</w:t>
       </w:r>
     </w:p>
     <w:p>
@@ -3084,7 +4766,7 @@
         <w:pStyle w:val="Compact"/>
         <w:numPr>
           <w:ilvl w:val="1"/>
-          <w:numId w:val="1007"/>
+          <w:numId w:val="1008"/>
         </w:numPr>
       </w:pPr>
       <w:r>
@@ -3121,7 +4803,7 @@
         <w:pStyle w:val="Compact"/>
         <w:numPr>
           <w:ilvl w:val="1"/>
-          <w:numId w:val="1007"/>
+          <w:numId w:val="1008"/>
         </w:numPr>
       </w:pPr>
       <w:r>
@@ -3143,7 +4825,7 @@
         <w:pStyle w:val="Compact"/>
         <w:numPr>
           <w:ilvl w:val="1"/>
-          <w:numId w:val="1007"/>
+          <w:numId w:val="1008"/>
         </w:numPr>
       </w:pPr>
       <w:r>
@@ -3165,7 +4847,7 @@
         <w:pStyle w:val="Compact"/>
         <w:numPr>
           <w:ilvl w:val="1"/>
-          <w:numId w:val="1007"/>
+          <w:numId w:val="1008"/>
         </w:numPr>
       </w:pPr>
       <w:r>
@@ -3187,7 +4869,7 @@
         <w:pStyle w:val="Compact"/>
         <w:numPr>
           <w:ilvl w:val="1"/>
-          <w:numId w:val="1007"/>
+          <w:numId w:val="1008"/>
         </w:numPr>
       </w:pPr>
       <w:r>
@@ -3209,7 +4891,7 @@
         <w:pStyle w:val="Compact"/>
         <w:numPr>
           <w:ilvl w:val="1"/>
-          <w:numId w:val="1007"/>
+          <w:numId w:val="1008"/>
         </w:numPr>
       </w:pPr>
       <w:r>
@@ -3224,6 +4906,52 @@
       </w:r>
       <w:r>
         <w:t xml:space="preserve">— enable/disable</w:t>
+      </w:r>
+    </w:p>
+    <w:p>
+      <w:pPr>
+        <w:pStyle w:val="Compact"/>
+        <w:numPr>
+          <w:ilvl w:val="1"/>
+          <w:numId w:val="1008"/>
+        </w:numPr>
+      </w:pPr>
+      <w:r>
+        <w:rPr>
+          <w:b/>
+          <w:bCs/>
+        </w:rPr>
+        <w:t xml:space="preserve">Route via Capillary</w:t>
+      </w:r>
+      <w:r>
+        <w:t xml:space="preserve"> </w:t>
+      </w:r>
+      <w:r>
+        <w:t xml:space="preserve">— enable to route traffic through an encrypted Aorta tunnel</w:t>
+      </w:r>
+    </w:p>
+    <w:p>
+      <w:pPr>
+        <w:pStyle w:val="Compact"/>
+        <w:numPr>
+          <w:ilvl w:val="2"/>
+          <w:numId w:val="1009"/>
+        </w:numPr>
+      </w:pPr>
+      <w:r>
+        <w:t xml:space="preserve">Select the Capillary node (remote agent)</w:t>
+      </w:r>
+    </w:p>
+    <w:p>
+      <w:pPr>
+        <w:pStyle w:val="Compact"/>
+        <w:numPr>
+          <w:ilvl w:val="2"/>
+          <w:numId w:val="1009"/>
+        </w:numPr>
+      </w:pPr>
+      <w:r>
+        <w:t xml:space="preserve">Set the local port at the remote site</w:t>
       </w:r>
     </w:p>
     <w:p>
@@ -3231,7 +4959,7 @@
         <w:pStyle w:val="Compact"/>
         <w:numPr>
           <w:ilvl w:val="0"/>
-          <w:numId w:val="1006"/>
+          <w:numId w:val="1007"/>
         </w:numPr>
       </w:pPr>
       <w:r>
@@ -3248,13 +4976,75 @@
         <w:t xml:space="preserve">Create</w:t>
       </w:r>
     </w:p>
-    <w:bookmarkEnd w:id="21"/>
-    <w:bookmarkStart w:id="22" w:name="right-panel-live-cp-log-viewer"/>
+    <w:bookmarkEnd w:id="24"/>
+    <w:bookmarkStart w:id="25" w:name="capillary-connection-indicator"/>
     <w:p>
       <w:pPr>
         <w:pStyle w:val="Heading3"/>
       </w:pPr>
       <w:r>
+        <w:t xml:space="preserve">Capillary Connection Indicator</w:t>
+      </w:r>
+    </w:p>
+    <w:p>
+      <w:pPr>
+        <w:pStyle w:val="FirstParagraph"/>
+      </w:pPr>
+      <w:r>
+        <w:t xml:space="preserve">Each CP card in the list shows which Capillary agent it is connected through:</w:t>
+      </w:r>
+      <w:r>
+        <w:t xml:space="preserve"> </w:t>
+      </w:r>
+      <w:r>
+        <w:t xml:space="preserve">-</w:t>
+      </w:r>
+      <w:r>
+        <w:t xml:space="preserve"> </w:t>
+      </w:r>
+      <w:r>
+        <w:rPr>
+          <w:b/>
+          <w:bCs/>
+        </w:rPr>
+        <w:t xml:space="preserve">⛓ Node Name (Site Name)</w:t>
+      </w:r>
+      <w:r>
+        <w:t xml:space="preserve"> </w:t>
+      </w:r>
+      <w:r>
+        <w:t xml:space="preserve">— with a green dot when the Capillary is connected</w:t>
+      </w:r>
+      <w:r>
+        <w:t xml:space="preserve"> </w:t>
+      </w:r>
+      <w:r>
+        <w:t xml:space="preserve">-</w:t>
+      </w:r>
+      <w:r>
+        <w:t xml:space="preserve"> </w:t>
+      </w:r>
+      <w:r>
+        <w:rPr>
+          <w:b/>
+          <w:bCs/>
+        </w:rPr>
+        <w:t xml:space="preserve">⛓ Node Name (Site Name)</w:t>
+      </w:r>
+      <w:r>
+        <w:t xml:space="preserve"> </w:t>
+      </w:r>
+      <w:r>
+        <w:t xml:space="preserve">— with a yellow dot when the Capillary is disconnected/enrolling</w:t>
+      </w:r>
+    </w:p>
+    <w:bookmarkEnd w:id="25"/>
+    <w:bookmarkStart w:id="26" w:name="right-panel-live-cp-log-viewer"/>
+    <w:p>
+      <w:pPr>
+        <w:pStyle w:val="Heading3"/>
+      </w:pPr>
+      <w:r>
         <w:t xml:space="preserve">Right Panel — Live CP Log Viewer</w:t>
       </w:r>
     </w:p>
@@ -3263,16 +5053,7 @@
         <w:pStyle w:val="FirstParagraph"/>
       </w:pPr>
       <w:r>
-        <w:t xml:space="preserve">Click any communication point to see its live log stream. This is equivalent to Rhapsody’s</w:t>
-      </w:r>
-      <w:r>
-        <w:t xml:space="preserve"> </w:t>
-      </w:r>
-      <w:r>
-        <w:t xml:space="preserve">“View Communication Point Log”</w:t>
-      </w:r>
-      <w:r>
-        <w:t xml:space="preserve">.</w:t>
+        <w:t xml:space="preserve">Click any communication point to see its live log stream.</w:t>
       </w:r>
     </w:p>
     <w:p>
@@ -3366,9 +5147,9 @@
         </w:pict>
       </w:r>
     </w:p>
-    <w:bookmarkEnd w:id="22"/>
-    <w:bookmarkEnd w:id="23"/>
-    <w:bookmarkStart w:id="25" w:name="errors-dlq"/>
+    <w:bookmarkEnd w:id="26"/>
+    <w:bookmarkEnd w:id="27"/>
+    <w:bookmarkStart w:id="29" w:name="errors-dlq"/>
     <w:p>
       <w:pPr>
         <w:pStyle w:val="Heading2"/>
@@ -3406,7 +5187,7 @@
         <w:t xml:space="preserve">The dead letter queue shows all messages that failed processing.</w:t>
       </w:r>
     </w:p>
-    <w:bookmarkStart w:id="24" w:name="error-table"/>
+    <w:bookmarkStart w:id="28" w:name="error-table"/>
     <w:p>
       <w:pPr>
         <w:pStyle w:val="Heading3"/>
@@ -3660,24 +5441,53 @@
         </w:pict>
       </w:r>
     </w:p>
-    <w:bookmarkEnd w:id="24"/>
-    <w:bookmarkEnd w:id="25"/>
-    <w:bookmarkStart w:id="30" w:name="common-workflows"/>
+    <w:bookmarkEnd w:id="28"/>
+    <w:bookmarkEnd w:id="29"/>
+    <w:bookmarkStart w:id="31" w:name="message-flow-live-visualization"/>
     <w:p>
       <w:pPr>
         <w:pStyle w:val="Heading2"/>
       </w:pPr>
       <w:r>
-        <w:t xml:space="preserve">6. Common Workflows</w:t>
-      </w:r>
-    </w:p>
-    <w:bookmarkStart w:id="26" w:name="setting-up-a-new-integration"/>
+        <w:t xml:space="preserve">6. Message Flow (Live Visualization)</w:t>
+      </w:r>
+    </w:p>
+    <w:p>
+      <w:pPr>
+        <w:pStyle w:val="FirstParagraph"/>
+      </w:pPr>
+      <w:r>
+        <w:rPr>
+          <w:b/>
+          <w:bCs/>
+        </w:rPr>
+        <w:t xml:space="preserve">URL:</w:t>
+      </w:r>
+      <w:r>
+        <w:t xml:space="preserve"> </w:t>
+      </w:r>
+      <w:r>
+        <w:rPr>
+          <w:rStyle w:val="VerbatimChar"/>
+        </w:rPr>
+        <w:t xml:space="preserve">/flow</w:t>
+      </w:r>
+    </w:p>
+    <w:p>
+      <w:pPr>
+        <w:pStyle w:val="BodyText"/>
+      </w:pPr>
+      <w:r>
+        <w:t xml:space="preserve">The Message Flow page provides a real-time visual representation of messages flowing through the pipeline.</w:t>
+      </w:r>
+    </w:p>
+    <w:bookmarkStart w:id="30" w:name="features"/>
     <w:p>
       <w:pPr>
         <w:pStyle w:val="Heading3"/>
       </w:pPr>
       <w:r>
-        <w:t xml:space="preserve">Setting Up a New Integration</w:t>
+        <w:t xml:space="preserve">Features</w:t>
       </w:r>
     </w:p>
     <w:p>
@@ -3685,7 +5495,7 @@
         <w:pStyle w:val="Compact"/>
         <w:numPr>
           <w:ilvl w:val="0"/>
-          <w:numId w:val="1008"/>
+          <w:numId w:val="1010"/>
         </w:numPr>
       </w:pPr>
       <w:r>
@@ -3693,25 +5503,13 @@
           <w:b/>
           <w:bCs/>
         </w:rPr>
-        <w:t xml:space="preserve">Create an INPUT Communication Point</w:t>
-      </w:r>
-      <w:r>
-        <w:t xml:space="preserve"> </w:t>
-      </w:r>
-      <w:r>
-        <w:t xml:space="preserve">— defines where Hospital A sends messages</w:t>
-      </w:r>
-    </w:p>
-    <w:p>
-      <w:pPr>
-        <w:pStyle w:val="Compact"/>
-        <w:numPr>
-          <w:ilvl w:val="1"/>
-          <w:numId w:val="1009"/>
-        </w:numPr>
-      </w:pPr>
-      <w:r>
-        <w:t xml:space="preserve">Protocol: MLLP, Port: 2575 (or custom)</w:t>
+        <w:t xml:space="preserve">Route selector</w:t>
+      </w:r>
+      <w:r>
+        <w:t xml:space="preserve"> </w:t>
+      </w:r>
+      <w:r>
+        <w:t xml:space="preserve">— pick a route to focus on, or view all routes</w:t>
       </w:r>
     </w:p>
     <w:p>
@@ -3719,33 +5517,21 @@
         <w:pStyle w:val="Compact"/>
         <w:numPr>
           <w:ilvl w:val="0"/>
-          <w:numId w:val="1008"/>
-        </w:numPr>
-      </w:pPr>
-      <w:r>
-        <w:rPr>
-          <w:b/>
-          <w:bCs/>
-        </w:rPr>
-        <w:t xml:space="preserve">Create an OUTPUT Communication Point</w:t>
-      </w:r>
-      <w:r>
-        <w:t xml:space="preserve"> </w:t>
-      </w:r>
-      <w:r>
-        <w:t xml:space="preserve">— defines where to deliver processed messages</w:t>
-      </w:r>
-    </w:p>
-    <w:p>
-      <w:pPr>
-        <w:pStyle w:val="Compact"/>
-        <w:numPr>
-          <w:ilvl w:val="1"/>
           <w:numId w:val="1010"/>
         </w:numPr>
       </w:pPr>
       <w:r>
-        <w:t xml:space="preserve">Protocol: MLLP or HTTP, Host: target system address, Port: target port</w:t>
+        <w:rPr>
+          <w:b/>
+          <w:bCs/>
+        </w:rPr>
+        <w:t xml:space="preserve">Live stream panel</w:t>
+      </w:r>
+      <w:r>
+        <w:t xml:space="preserve"> </w:t>
+      </w:r>
+      <w:r>
+        <w:t xml:space="preserve">— messages appear as they flow through in real-time via WebSocket</w:t>
       </w:r>
     </w:p>
     <w:p>
@@ -3753,7 +5539,7 @@
         <w:pStyle w:val="Compact"/>
         <w:numPr>
           <w:ilvl w:val="0"/>
-          <w:numId w:val="1008"/>
+          <w:numId w:val="1010"/>
         </w:numPr>
       </w:pPr>
       <w:r>
@@ -3761,88 +5547,13 @@
           <w:b/>
           <w:bCs/>
         </w:rPr>
-        <w:t xml:space="preserve">Create a Route</w:t>
-      </w:r>
-      <w:r>
-        <w:t xml:space="preserve"> </w:t>
-      </w:r>
-      <w:r>
-        <w:t xml:space="preserve">— connects the input to the output</w:t>
-      </w:r>
-    </w:p>
-    <w:p>
-      <w:pPr>
-        <w:pStyle w:val="Compact"/>
-        <w:numPr>
-          <w:ilvl w:val="1"/>
-          <w:numId w:val="1011"/>
-        </w:numPr>
-      </w:pPr>
-      <w:r>
-        <w:t xml:space="preserve">Source Comm Point: your INPUT CP</w:t>
-      </w:r>
-    </w:p>
-    <w:p>
-      <w:pPr>
-        <w:pStyle w:val="Compact"/>
-        <w:numPr>
-          <w:ilvl w:val="1"/>
-          <w:numId w:val="1011"/>
-        </w:numPr>
-      </w:pPr>
-      <w:r>
-        <w:t xml:space="preserve">Dest Comm Point: your OUTPUT CP</w:t>
-      </w:r>
-    </w:p>
-    <w:p>
-      <w:pPr>
-        <w:pStyle w:val="Compact"/>
-        <w:numPr>
-          <w:ilvl w:val="1"/>
-          <w:numId w:val="1011"/>
-        </w:numPr>
-      </w:pPr>
-      <w:r>
-        <w:t xml:space="preserve">Source Topic: the HL7 message type to match (e.g.,</w:t>
-      </w:r>
-      <w:r>
-        <w:t xml:space="preserve"> </w:t>
-      </w:r>
-      <w:r>
-        <w:rPr>
-          <w:rStyle w:val="VerbatimChar"/>
-        </w:rPr>
-        <w:t xml:space="preserve">ADT^A01</w:t>
-      </w:r>
-      <w:r>
-        <w:t xml:space="preserve"> </w:t>
-      </w:r>
-      <w:r>
-        <w:t xml:space="preserve">or</w:t>
-      </w:r>
-      <w:r>
-        <w:t xml:space="preserve"> </w:t>
-      </w:r>
-      <w:r>
-        <w:rPr>
-          <w:rStyle w:val="VerbatimChar"/>
-        </w:rPr>
-        <w:t xml:space="preserve">*</w:t>
-      </w:r>
-      <w:r>
-        <w:t xml:space="preserve">)</w:t>
-      </w:r>
-    </w:p>
-    <w:p>
-      <w:pPr>
-        <w:pStyle w:val="Compact"/>
-        <w:numPr>
-          <w:ilvl w:val="1"/>
-          <w:numId w:val="1011"/>
-        </w:numPr>
-      </w:pPr>
-      <w:r>
-        <w:t xml:space="preserve">Destination Topic: a logical name for the route</w:t>
+        <w:t xml:space="preserve">Visual pipeline</w:t>
+      </w:r>
+      <w:r>
+        <w:t xml:space="preserve"> </w:t>
+      </w:r>
+      <w:r>
+        <w:t xml:space="preserve">— glassmorphic cards showing Input CP → Route → Filters → Output CP(s), connected by animated bezier edges</w:t>
       </w:r>
     </w:p>
     <w:p>
@@ -3850,7 +5561,7 @@
         <w:pStyle w:val="Compact"/>
         <w:numPr>
           <w:ilvl w:val="0"/>
-          <w:numId w:val="1008"/>
+          <w:numId w:val="1010"/>
         </w:numPr>
       </w:pPr>
       <w:r>
@@ -3858,13 +5569,441 @@
           <w:b/>
           <w:bCs/>
         </w:rPr>
-        <w:t xml:space="preserve">Add Filters</w:t>
-      </w:r>
-      <w:r>
-        <w:t xml:space="preserve"> </w:t>
-      </w:r>
-      <w:r>
-        <w:t xml:space="preserve">(optional) — click the route and add processing steps</w:t>
+        <w:t xml:space="preserve">Live counters</w:t>
+      </w:r>
+      <w:r>
+        <w:t xml:space="preserve"> </w:t>
+      </w:r>
+      <w:r>
+        <w:t xml:space="preserve">— received, routed, delivered, and error counts update in real-time</w:t>
+      </w:r>
+    </w:p>
+    <w:p>
+      <w:pPr>
+        <w:pStyle w:val="Compact"/>
+        <w:numPr>
+          <w:ilvl w:val="0"/>
+          <w:numId w:val="1010"/>
+        </w:numPr>
+      </w:pPr>
+      <w:r>
+        <w:rPr>
+          <w:b/>
+          <w:bCs/>
+        </w:rPr>
+        <w:t xml:space="preserve">Trace panel</w:t>
+      </w:r>
+      <w:r>
+        <w:t xml:space="preserve"> </w:t>
+      </w:r>
+      <w:r>
+        <w:t xml:space="preserve">— click any message to see its full journey through the pipeline</w:t>
+      </w:r>
+    </w:p>
+    <w:p>
+      <w:pPr>
+        <w:pStyle w:val="Compact"/>
+        <w:numPr>
+          <w:ilvl w:val="0"/>
+          <w:numId w:val="1010"/>
+        </w:numPr>
+      </w:pPr>
+      <w:r>
+        <w:rPr>
+          <w:b/>
+          <w:bCs/>
+        </w:rPr>
+        <w:t xml:space="preserve">Filter test panel</w:t>
+      </w:r>
+      <w:r>
+        <w:t xml:space="preserve"> </w:t>
+      </w:r>
+      <w:r>
+        <w:t xml:space="preserve">— test filter scripts against live message payloads</w:t>
+      </w:r>
+    </w:p>
+    <w:p>
+      <w:pPr>
+        <w:pStyle w:val="FirstParagraph"/>
+      </w:pPr>
+      <w:r>
+        <w:t xml:space="preserve">The page connects via WebSocket (</w:t>
+      </w:r>
+      <w:r>
+        <w:rPr>
+          <w:rStyle w:val="VerbatimChar"/>
+        </w:rPr>
+        <w:t xml:space="preserve">/ws/flow</w:t>
+      </w:r>
+      <w:r>
+        <w:t xml:space="preserve">) with an HTTP polling fallback (every 3s).</w:t>
+      </w:r>
+    </w:p>
+    <w:p>
+      <w:r>
+        <w:pict>
+          <v:rect style="width:0;height:1.5pt" o:hralign="center" o:hrstd="t" o:hr="t"/>
+        </w:pict>
+      </w:r>
+    </w:p>
+    <w:bookmarkEnd w:id="30"/>
+    <w:bookmarkEnd w:id="31"/>
+    <w:bookmarkStart w:id="32" w:name="message-control"/>
+    <w:p>
+      <w:pPr>
+        <w:pStyle w:val="Heading2"/>
+      </w:pPr>
+      <w:r>
+        <w:t xml:space="preserve">7. Message Control</w:t>
+      </w:r>
+    </w:p>
+    <w:p>
+      <w:pPr>
+        <w:pStyle w:val="FirstParagraph"/>
+      </w:pPr>
+      <w:r>
+        <w:t xml:space="preserve">From the Messages page or via the API, you can control individual messages:</w:t>
+      </w:r>
+    </w:p>
+    <w:tbl>
+      <w:tblPr>
+        <w:tblStyle w:val="Table"/>
+        <w:tblW w:type="auto" w:w="0"/>
+        <w:tblLook w:firstRow="1" w:lastRow="0" w:firstColumn="0" w:lastColumn="0" w:noHBand="0" w:noVBand="0" w:val="0020"/>
+      </w:tblPr>
+      <w:tblGrid>
+        <w:gridCol w:w="3960"/>
+        <w:gridCol w:w="3960"/>
+      </w:tblGrid>
+      <w:tr>
+        <w:trPr>
+          <w:tblHeader w:val="on"/>
+        </w:trPr>
+        <w:tc>
+          <w:tcPr/>
+          <w:p>
+            <w:pPr>
+              <w:pStyle w:val="Compact"/>
+            </w:pPr>
+            <w:r>
+              <w:t xml:space="preserve">Action</w:t>
+            </w:r>
+          </w:p>
+        </w:tc>
+        <w:tc>
+          <w:tcPr/>
+          <w:p>
+            <w:pPr>
+              <w:pStyle w:val="Compact"/>
+            </w:pPr>
+            <w:r>
+              <w:t xml:space="preserve">Effect</w:t>
+            </w:r>
+          </w:p>
+        </w:tc>
+      </w:tr>
+      <w:tr>
+        <w:tc>
+          <w:tcPr/>
+          <w:p>
+            <w:pPr>
+              <w:pStyle w:val="Compact"/>
+            </w:pPr>
+            <w:r>
+              <w:rPr>
+                <w:b/>
+                <w:bCs/>
+              </w:rPr>
+              <w:t xml:space="preserve">Drop</w:t>
+            </w:r>
+          </w:p>
+        </w:tc>
+        <w:tc>
+          <w:tcPr/>
+          <w:p>
+            <w:pPr>
+              <w:pStyle w:val="Compact"/>
+            </w:pPr>
+            <w:r>
+              <w:t xml:space="preserve">Mark message as DROPPED, remove from delivery queue</w:t>
+            </w:r>
+          </w:p>
+        </w:tc>
+      </w:tr>
+      <w:tr>
+        <w:tc>
+          <w:tcPr/>
+          <w:p>
+            <w:pPr>
+              <w:pStyle w:val="Compact"/>
+            </w:pPr>
+            <w:r>
+              <w:rPr>
+                <w:b/>
+                <w:bCs/>
+              </w:rPr>
+              <w:t xml:space="preserve">Retry</w:t>
+            </w:r>
+          </w:p>
+        </w:tc>
+        <w:tc>
+          <w:tcPr/>
+          <w:p>
+            <w:pPr>
+              <w:pStyle w:val="Compact"/>
+            </w:pPr>
+            <w:r>
+              <w:t xml:space="preserve">Re-inject a failed message back into ingestion</w:t>
+            </w:r>
+          </w:p>
+        </w:tc>
+      </w:tr>
+      <w:tr>
+        <w:tc>
+          <w:tcPr/>
+          <w:p>
+            <w:pPr>
+              <w:pStyle w:val="Compact"/>
+            </w:pPr>
+            <w:r>
+              <w:rPr>
+                <w:b/>
+                <w:bCs/>
+              </w:rPr>
+              <w:t xml:space="preserve">Hold</w:t>
+            </w:r>
+          </w:p>
+        </w:tc>
+        <w:tc>
+          <w:tcPr/>
+          <w:p>
+            <w:pPr>
+              <w:pStyle w:val="Compact"/>
+            </w:pPr>
+            <w:r>
+              <w:t xml:space="preserve">Pause delivery, mark as HELD</w:t>
+            </w:r>
+          </w:p>
+        </w:tc>
+      </w:tr>
+      <w:tr>
+        <w:tc>
+          <w:tcPr/>
+          <w:p>
+            <w:pPr>
+              <w:pStyle w:val="Compact"/>
+            </w:pPr>
+            <w:r>
+              <w:rPr>
+                <w:b/>
+                <w:bCs/>
+              </w:rPr>
+              <w:t xml:space="preserve">Release</w:t>
+            </w:r>
+          </w:p>
+        </w:tc>
+        <w:tc>
+          <w:tcPr/>
+          <w:p>
+            <w:pPr>
+              <w:pStyle w:val="Compact"/>
+            </w:pPr>
+            <w:r>
+              <w:t xml:space="preserve">Release a held message back into processing</w:t>
+            </w:r>
+          </w:p>
+        </w:tc>
+      </w:tr>
+      <w:tr>
+        <w:tc>
+          <w:tcPr/>
+          <w:p>
+            <w:pPr>
+              <w:pStyle w:val="Compact"/>
+            </w:pPr>
+            <w:r>
+              <w:rPr>
+                <w:b/>
+                <w:bCs/>
+              </w:rPr>
+              <w:t xml:space="preserve">Flush</w:t>
+            </w:r>
+          </w:p>
+        </w:tc>
+        <w:tc>
+          <w:tcPr/>
+          <w:p>
+            <w:pPr>
+              <w:pStyle w:val="Compact"/>
+            </w:pPr>
+            <w:r>
+              <w:t xml:space="preserve">Purge all queued messages for a route</w:t>
+            </w:r>
+          </w:p>
+        </w:tc>
+      </w:tr>
+    </w:tbl>
+    <w:p>
+      <w:r>
+        <w:pict>
+          <v:rect style="width:0;height:1.5pt" o:hralign="center" o:hrstd="t" o:hr="t"/>
+        </w:pict>
+      </w:r>
+    </w:p>
+    <w:bookmarkEnd w:id="32"/>
+    <w:bookmarkStart w:id="33" w:name="patient-journey"/>
+    <w:p>
+      <w:pPr>
+        <w:pStyle w:val="Heading2"/>
+      </w:pPr>
+      <w:r>
+        <w:t xml:space="preserve">8. Patient Journey</w:t>
+      </w:r>
+    </w:p>
+    <w:p>
+      <w:pPr>
+        <w:pStyle w:val="FirstParagraph"/>
+      </w:pPr>
+      <w:r>
+        <w:rPr>
+          <w:b/>
+          <w:bCs/>
+        </w:rPr>
+        <w:t xml:space="preserve">URL:</w:t>
+      </w:r>
+      <w:r>
+        <w:t xml:space="preserve"> </w:t>
+      </w:r>
+      <w:r>
+        <w:rPr>
+          <w:rStyle w:val="VerbatimChar"/>
+        </w:rPr>
+        <w:t xml:space="preserve">/patient-journey</w:t>
+      </w:r>
+    </w:p>
+    <w:p>
+      <w:pPr>
+        <w:pStyle w:val="BodyText"/>
+      </w:pPr>
+      <w:r>
+        <w:t xml:space="preserve">Search by MRN (Medical Record Number) to see a timeline of all messages for a patient. Events are color-coded by message type and displayed chronologically.</w:t>
+      </w:r>
+    </w:p>
+    <w:p>
+      <w:r>
+        <w:pict>
+          <v:rect style="width:0;height:1.5pt" o:hralign="center" o:hrstd="t" o:hr="t"/>
+        </w:pict>
+      </w:r>
+    </w:p>
+    <w:bookmarkEnd w:id="33"/>
+    <w:bookmarkStart w:id="34" w:name="ai-filter-generator"/>
+    <w:p>
+      <w:pPr>
+        <w:pStyle w:val="Heading2"/>
+      </w:pPr>
+      <w:r>
+        <w:t xml:space="preserve">9. AI Filter Generator</w:t>
+      </w:r>
+    </w:p>
+    <w:p>
+      <w:pPr>
+        <w:pStyle w:val="FirstParagraph"/>
+      </w:pPr>
+      <w:r>
+        <w:rPr>
+          <w:b/>
+          <w:bCs/>
+        </w:rPr>
+        <w:t xml:space="preserve">URL:</w:t>
+      </w:r>
+      <w:r>
+        <w:t xml:space="preserve"> </w:t>
+      </w:r>
+      <w:r>
+        <w:rPr>
+          <w:rStyle w:val="VerbatimChar"/>
+        </w:rPr>
+        <w:t xml:space="preserve">/ai-filters</w:t>
+      </w:r>
+    </w:p>
+    <w:p>
+      <w:pPr>
+        <w:pStyle w:val="BodyText"/>
+      </w:pPr>
+      <w:r>
+        <w:t xml:space="preserve">Describe what you want a filter to do in plain English, and Arteria generates the filter code (Python or JavaScript). Includes a Monaco editor to review and modify the generated code before saving.</w:t>
+      </w:r>
+    </w:p>
+    <w:p>
+      <w:pPr>
+        <w:pStyle w:val="BodyText"/>
+      </w:pPr>
+      <w:r>
+        <w:rPr>
+          <w:b/>
+          <w:bCs/>
+        </w:rPr>
+        <w:t xml:space="preserve">Example:</w:t>
+      </w:r>
+      <w:r>
+        <w:t xml:space="preserve"> </w:t>
+      </w:r>
+      <w:r>
+        <w:t xml:space="preserve">“reject messages without a patient ID”</w:t>
+      </w:r>
+      <w:r>
+        <w:t xml:space="preserve"> </w:t>
+      </w:r>
+      <w:r>
+        <w:t xml:space="preserve">→ generates a conditional filter script.</w:t>
+      </w:r>
+    </w:p>
+    <w:p>
+      <w:r>
+        <w:pict>
+          <v:rect style="width:0;height:1.5pt" o:hralign="center" o:hrstd="t" o:hr="t"/>
+        </w:pict>
+      </w:r>
+    </w:p>
+    <w:bookmarkEnd w:id="34"/>
+    <w:bookmarkStart w:id="40" w:name="common-workflows"/>
+    <w:p>
+      <w:pPr>
+        <w:pStyle w:val="Heading2"/>
+      </w:pPr>
+      <w:r>
+        <w:t xml:space="preserve">10. Common Workflows</w:t>
+      </w:r>
+    </w:p>
+    <w:bookmarkStart w:id="35" w:name="setting-up-a-new-integration"/>
+    <w:p>
+      <w:pPr>
+        <w:pStyle w:val="Heading3"/>
+      </w:pPr>
+      <w:r>
+        <w:t xml:space="preserve">Setting Up a New Integration</w:t>
+      </w:r>
+    </w:p>
+    <w:p>
+      <w:pPr>
+        <w:numPr>
+          <w:ilvl w:val="0"/>
+          <w:numId w:val="1011"/>
+        </w:numPr>
+      </w:pPr>
+      <w:r>
+        <w:rPr>
+          <w:b/>
+          <w:bCs/>
+        </w:rPr>
+        <w:t xml:space="preserve">Create an INPUT Communication Point</w:t>
+      </w:r>
+      <w:r>
+        <w:t xml:space="preserve"> </w:t>
+      </w:r>
+      <w:r>
+        <w:t xml:space="preserve">— defines where Hospital A sends messages</w:t>
       </w:r>
     </w:p>
     <w:p>
@@ -3876,7 +6015,28 @@
         </w:numPr>
       </w:pPr>
       <w:r>
-        <w:t xml:space="preserve">Add a conditional filter to validate messages</w:t>
+        <w:t xml:space="preserve">Protocol: MLLP, Port: 2575 (or custom)</w:t>
+      </w:r>
+    </w:p>
+    <w:p>
+      <w:pPr>
+        <w:numPr>
+          <w:ilvl w:val="0"/>
+          <w:numId w:val="1011"/>
+        </w:numPr>
+      </w:pPr>
+      <w:r>
+        <w:rPr>
+          <w:b/>
+          <w:bCs/>
+        </w:rPr>
+        <w:t xml:space="preserve">Create an OUTPUT Communication Point</w:t>
+      </w:r>
+      <w:r>
+        <w:t xml:space="preserve"> </w:t>
+      </w:r>
+      <w:r>
+        <w:t xml:space="preserve">— defines where to deliver processed messages</w:t>
       </w:r>
     </w:p>
     <w:p>
@@ -3884,11 +6044,11 @@
         <w:pStyle w:val="Compact"/>
         <w:numPr>
           <w:ilvl w:val="1"/>
-          <w:numId w:val="1012"/>
+          <w:numId w:val="1013"/>
         </w:numPr>
       </w:pPr>
       <w:r>
-        <w:t xml:space="preserve">Add a JS transform to modify or enrich messages</w:t>
+        <w:t xml:space="preserve">Protocol: MLLP, HTTP/Webhook, or Discard (null sink for testing)</w:t>
       </w:r>
     </w:p>
     <w:p>
@@ -3896,19 +6056,40 @@
         <w:pStyle w:val="Compact"/>
         <w:numPr>
           <w:ilvl w:val="1"/>
-          <w:numId w:val="1012"/>
+          <w:numId w:val="1013"/>
         </w:numPr>
       </w:pPr>
       <w:r>
-        <w:t xml:space="preserve">Arrange execution order (lower numbers run first)</w:t>
+        <w:t xml:space="preserve">Host: target system address, Port: target port</w:t>
       </w:r>
     </w:p>
     <w:p>
       <w:pPr>
         <w:pStyle w:val="Compact"/>
         <w:numPr>
+          <w:ilvl w:val="1"/>
+          <w:numId w:val="1013"/>
+        </w:numPr>
+      </w:pPr>
+      <w:r>
+        <w:t xml:space="preserve">For testing without a real destination, use</w:t>
+      </w:r>
+      <w:r>
+        <w:t xml:space="preserve"> </w:t>
+      </w:r>
+      <w:r>
+        <w:rPr>
+          <w:b/>
+          <w:bCs/>
+        </w:rPr>
+        <w:t xml:space="preserve">Discard (Null Sink)</w:t>
+      </w:r>
+    </w:p>
+    <w:p>
+      <w:pPr>
+        <w:numPr>
           <w:ilvl w:val="0"/>
-          <w:numId w:val="1008"/>
+          <w:numId w:val="1011"/>
         </w:numPr>
       </w:pPr>
       <w:r>
@@ -3916,354 +6097,136 @@
           <w:b/>
           <w:bCs/>
         </w:rPr>
-        <w:t xml:space="preserve">Monitor</w:t>
-      </w:r>
-      <w:r>
-        <w:t xml:space="preserve"> </w:t>
-      </w:r>
-      <w:r>
-        <w:t xml:space="preserve">— go to the Dashboard to watch throughput, or click the CP to see its live log</w:t>
-      </w:r>
-    </w:p>
-    <w:bookmarkEnd w:id="26"/>
-    <w:bookmarkStart w:id="27" w:name="debugging-a-failed-message"/>
-    <w:p>
-      <w:pPr>
-        <w:pStyle w:val="Heading3"/>
-      </w:pPr>
-      <w:r>
-        <w:t xml:space="preserve">Debugging a Failed Message</w:t>
+        <w:t xml:space="preserve">Create a Route</w:t>
+      </w:r>
+      <w:r>
+        <w:t xml:space="preserve"> </w:t>
+      </w:r>
+      <w:r>
+        <w:t xml:space="preserve">— connects the input to the output</w:t>
       </w:r>
     </w:p>
     <w:p>
       <w:pPr>
         <w:pStyle w:val="Compact"/>
         <w:numPr>
-          <w:ilvl w:val="0"/>
-          <w:numId w:val="1013"/>
+          <w:ilvl w:val="1"/>
+          <w:numId w:val="1014"/>
         </w:numPr>
       </w:pPr>
       <w:r>
-        <w:t xml:space="preserve">Go to</w:t>
-      </w:r>
-      <w:r>
-        <w:t xml:space="preserve"> </w:t>
-      </w:r>
-      <w:r>
-        <w:rPr>
-          <w:b/>
-          <w:bCs/>
-        </w:rPr>
-        <w:t xml:space="preserve">Errors / DLQ</w:t>
-      </w:r>
-      <w:r>
-        <w:t xml:space="preserve"> </w:t>
-      </w:r>
-      <w:r>
-        <w:t xml:space="preserve">— find the failed message</w:t>
+        <w:t xml:space="preserve">Source Topic: the HL7 message type to match (e.g.,</w:t>
+      </w:r>
+      <w:r>
+        <w:t xml:space="preserve"> </w:t>
+      </w:r>
+      <w:r>
+        <w:rPr>
+          <w:rStyle w:val="VerbatimChar"/>
+        </w:rPr>
+        <w:t xml:space="preserve">ADT^A01</w:t>
+      </w:r>
+      <w:r>
+        <w:t xml:space="preserve"> </w:t>
+      </w:r>
+      <w:r>
+        <w:t xml:space="preserve">or</w:t>
+      </w:r>
+      <w:r>
+        <w:t xml:space="preserve"> </w:t>
+      </w:r>
+      <w:r>
+        <w:rPr>
+          <w:rStyle w:val="VerbatimChar"/>
+        </w:rPr>
+        <w:t xml:space="preserve">*</w:t>
+      </w:r>
+      <w:r>
+        <w:t xml:space="preserve">)</w:t>
       </w:r>
     </w:p>
     <w:p>
       <w:pPr>
         <w:pStyle w:val="Compact"/>
         <w:numPr>
+          <w:ilvl w:val="1"/>
+          <w:numId w:val="1014"/>
+        </w:numPr>
+      </w:pPr>
+      <w:r>
+        <w:t xml:space="preserve">Destination Topic: a logical name for the route</w:t>
+      </w:r>
+    </w:p>
+    <w:p>
+      <w:pPr>
+        <w:numPr>
           <w:ilvl w:val="0"/>
-          <w:numId w:val="1013"/>
+          <w:numId w:val="1011"/>
         </w:numPr>
       </w:pPr>
       <w:r>
-        <w:t xml:space="preserve">Note the</w:t>
-      </w:r>
-      <w:r>
-        <w:t xml:space="preserve"> </w:t>
-      </w:r>
-      <w:r>
-        <w:rPr>
-          <w:b/>
-          <w:bCs/>
-        </w:rPr>
-        <w:t xml:space="preserve">Message ID</w:t>
-      </w:r>
-      <w:r>
-        <w:t xml:space="preserve"> </w:t>
-      </w:r>
-      <w:r>
-        <w:t xml:space="preserve">and</w:t>
-      </w:r>
-      <w:r>
-        <w:t xml:space="preserve"> </w:t>
-      </w:r>
-      <w:r>
-        <w:rPr>
-          <w:b/>
-          <w:bCs/>
-        </w:rPr>
-        <w:t xml:space="preserve">Error Details</w:t>
+        <w:rPr>
+          <w:b/>
+          <w:bCs/>
+        </w:rPr>
+        <w:t xml:space="preserve">Add Filters</w:t>
+      </w:r>
+      <w:r>
+        <w:t xml:space="preserve"> </w:t>
+      </w:r>
+      <w:r>
+        <w:t xml:space="preserve">(optional) — click the route and add processing steps</w:t>
       </w:r>
     </w:p>
     <w:p>
       <w:pPr>
         <w:pStyle w:val="Compact"/>
         <w:numPr>
-          <w:ilvl w:val="0"/>
-          <w:numId w:val="1013"/>
+          <w:ilvl w:val="1"/>
+          <w:numId w:val="1015"/>
         </w:numPr>
       </w:pPr>
       <w:r>
-        <w:t xml:space="preserve">Go to</w:t>
-      </w:r>
-      <w:r>
-        <w:t xml:space="preserve"> </w:t>
-      </w:r>
-      <w:r>
-        <w:rPr>
-          <w:b/>
-          <w:bCs/>
-        </w:rPr>
-        <w:t xml:space="preserve">Messages</w:t>
-      </w:r>
-      <w:r>
-        <w:t xml:space="preserve"> </w:t>
-      </w:r>
-      <w:r>
-        <w:t xml:space="preserve">— search for the message by scanning the list</w:t>
+        <w:t xml:space="preserve">Add a conditional filter to validate messages</w:t>
       </w:r>
     </w:p>
     <w:p>
       <w:pPr>
         <w:pStyle w:val="Compact"/>
         <w:numPr>
-          <w:ilvl w:val="0"/>
-          <w:numId w:val="1013"/>
+          <w:ilvl w:val="1"/>
+          <w:numId w:val="1015"/>
         </w:numPr>
       </w:pPr>
       <w:r>
-        <w:t xml:space="preserve">Click the message to see the</w:t>
-      </w:r>
-      <w:r>
-        <w:t xml:space="preserve"> </w:t>
-      </w:r>
-      <w:r>
-        <w:rPr>
-          <w:b/>
-          <w:bCs/>
-        </w:rPr>
-        <w:t xml:space="preserve">Raw Payload</w:t>
-      </w:r>
-      <w:r>
-        <w:t xml:space="preserve"> </w:t>
-      </w:r>
-      <w:r>
-        <w:t xml:space="preserve">(what was received)</w:t>
+        <w:t xml:space="preserve">Add a JS transform to modify or enrich messages</w:t>
       </w:r>
     </w:p>
     <w:p>
       <w:pPr>
         <w:pStyle w:val="Compact"/>
         <w:numPr>
-          <w:ilvl w:val="0"/>
-          <w:numId w:val="1013"/>
+          <w:ilvl w:val="1"/>
+          <w:numId w:val="1015"/>
         </w:numPr>
       </w:pPr>
       <w:r>
-        <w:t xml:space="preserve">Check the error: was it a filter rejection? A timeout? A validation failure?</w:t>
-      </w:r>
-    </w:p>
-    <w:p>
-      <w:pPr>
-        <w:pStyle w:val="Compact"/>
+        <w:t xml:space="preserve">Arrange execution order (lower numbers run first)</w:t>
+      </w:r>
+    </w:p>
+    <w:p>
+      <w:pPr>
         <w:numPr>
           <w:ilvl w:val="0"/>
-          <w:numId w:val="1013"/>
+          <w:numId w:val="1011"/>
         </w:numPr>
       </w:pPr>
       <w:r>
-        <w:t xml:space="preserve">Go to</w:t>
-      </w:r>
-      <w:r>
-        <w:t xml:space="preserve"> </w:t>
-      </w:r>
-      <w:r>
-        <w:rPr>
-          <w:b/>
-          <w:bCs/>
-        </w:rPr>
-        <w:t xml:space="preserve">Routes</w:t>
-      </w:r>
-      <w:r>
-        <w:t xml:space="preserve"> </w:t>
-      </w:r>
-      <w:r>
-        <w:t xml:space="preserve">— open the route and check the filter chain</w:t>
-      </w:r>
-    </w:p>
-    <w:p>
-      <w:pPr>
-        <w:pStyle w:val="Compact"/>
-        <w:numPr>
-          <w:ilvl w:val="0"/>
-          <w:numId w:val="1013"/>
-        </w:numPr>
-      </w:pPr>
-      <w:r>
-        <w:t xml:space="preserve">Edit the filter script if needed, click</w:t>
-      </w:r>
-      <w:r>
-        <w:t xml:space="preserve"> </w:t>
-      </w:r>
-      <w:r>
-        <w:rPr>
-          <w:b/>
-          <w:bCs/>
-        </w:rPr>
-        <w:t xml:space="preserve">Save Filter</w:t>
-      </w:r>
-    </w:p>
-    <w:p>
-      <w:pPr>
-        <w:pStyle w:val="Compact"/>
-        <w:numPr>
-          <w:ilvl w:val="0"/>
-          <w:numId w:val="1013"/>
-        </w:numPr>
-      </w:pPr>
-      <w:r>
-        <w:t xml:space="preserve">The processing service reloads routes every 30 seconds — or restart it to apply immediately</w:t>
-      </w:r>
-    </w:p>
-    <w:bookmarkEnd w:id="27"/>
-    <w:bookmarkStart w:id="28" w:name="monitoring-throughput"/>
-    <w:p>
-      <w:pPr>
-        <w:pStyle w:val="Heading3"/>
-      </w:pPr>
-      <w:r>
-        <w:t xml:space="preserve">Monitoring Throughput</w:t>
-      </w:r>
-    </w:p>
-    <w:p>
-      <w:pPr>
-        <w:pStyle w:val="Compact"/>
-        <w:numPr>
-          <w:ilvl w:val="0"/>
-          <w:numId w:val="1014"/>
-        </w:numPr>
-      </w:pPr>
-      <w:r>
-        <w:t xml:space="preserve">Go to</w:t>
-      </w:r>
-      <w:r>
-        <w:t xml:space="preserve"> </w:t>
-      </w:r>
-      <w:r>
-        <w:rPr>
-          <w:b/>
-          <w:bCs/>
-        </w:rPr>
-        <w:t xml:space="preserve">Dashboard</w:t>
-      </w:r>
-      <w:r>
-        <w:t xml:space="preserve"> </w:t>
-      </w:r>
-      <w:r>
-        <w:t xml:space="preserve">— the live metrics panels update every 3 seconds</w:t>
-      </w:r>
-    </w:p>
-    <w:p>
-      <w:pPr>
-        <w:pStyle w:val="Compact"/>
-        <w:numPr>
-          <w:ilvl w:val="0"/>
-          <w:numId w:val="1014"/>
-        </w:numPr>
-      </w:pPr>
-      <w:r>
-        <w:t xml:space="preserve">Check</w:t>
-      </w:r>
-      <w:r>
-        <w:t xml:space="preserve"> </w:t>
-      </w:r>
-      <w:r>
-        <w:rPr>
-          <w:b/>
-          <w:bCs/>
-        </w:rPr>
-        <w:t xml:space="preserve">msgs/min</w:t>
-      </w:r>
-      <w:r>
-        <w:t xml:space="preserve"> </w:t>
-      </w:r>
-      <w:r>
-        <w:t xml:space="preserve">on both ingestion and processing</w:t>
-      </w:r>
-    </w:p>
-    <w:p>
-      <w:pPr>
-        <w:pStyle w:val="Compact"/>
-        <w:numPr>
-          <w:ilvl w:val="0"/>
-          <w:numId w:val="1014"/>
-        </w:numPr>
-      </w:pPr>
-      <w:r>
-        <w:t xml:space="preserve">If processing is slower than ingestion, messages are queuing in NATS</w:t>
-      </w:r>
-    </w:p>
-    <w:p>
-      <w:pPr>
-        <w:pStyle w:val="Compact"/>
-        <w:numPr>
-          <w:ilvl w:val="0"/>
-          <w:numId w:val="1014"/>
-        </w:numPr>
-      </w:pPr>
-      <w:r>
-        <w:t xml:space="preserve">Click a</w:t>
-      </w:r>
-      <w:r>
-        <w:t xml:space="preserve"> </w:t>
-      </w:r>
-      <w:r>
-        <w:rPr>
-          <w:b/>
-          <w:bCs/>
-        </w:rPr>
-        <w:t xml:space="preserve">Comm Point</w:t>
-      </w:r>
-      <w:r>
-        <w:t xml:space="preserve"> </w:t>
-      </w:r>
-      <w:r>
-        <w:t xml:space="preserve">to see per-CP received/error counts and live logs</w:t>
-      </w:r>
-    </w:p>
-    <w:bookmarkEnd w:id="28"/>
-    <w:bookmarkStart w:id="29" w:name="changing-log-verbosity-at-runtime"/>
-    <w:p>
-      <w:pPr>
-        <w:pStyle w:val="Heading3"/>
-      </w:pPr>
-      <w:r>
-        <w:t xml:space="preserve">Changing Log Verbosity at Runtime</w:t>
-      </w:r>
-    </w:p>
-    <w:p>
-      <w:pPr>
-        <w:pStyle w:val="FirstParagraph"/>
-      </w:pPr>
-      <w:r>
-        <w:t xml:space="preserve">You can reduce log noise without restarting:</w:t>
-      </w:r>
-    </w:p>
-    <w:p>
-      <w:pPr>
-        <w:numPr>
-          <w:ilvl w:val="0"/>
-          <w:numId w:val="1015"/>
-        </w:numPr>
-      </w:pPr>
-      <w:r>
-        <w:t xml:space="preserve">Use the API (there is no UI toggle yet):</w:t>
+        <w:rPr>
+          <w:b/>
+          <w:bCs/>
+        </w:rPr>
+        <w:t xml:space="preserve">Messages flow automatically:</w:t>
       </w:r>
     </w:p>
     <w:p>
@@ -4276,6 +6239,541 @@
       </w:pPr>
       <w:r>
         <w:rPr>
+          <w:rStyle w:val="VerbatimChar"/>
+        </w:rPr>
+        <w:t xml:space="preserve">INPUT CP → Ingestion → NATS → Processing (filters) → Route → Egress → OUTPUT CP</w:t>
+      </w:r>
+    </w:p>
+    <w:p>
+      <w:pPr>
+        <w:numPr>
+          <w:ilvl w:val="0"/>
+          <w:numId w:val="1000"/>
+        </w:numPr>
+      </w:pPr>
+      <w:r>
+        <w:t xml:space="preserve">The egress service picks up routed messages and delivers them to all matching OUTPUT CPs.</w:t>
+      </w:r>
+    </w:p>
+    <w:p>
+      <w:pPr>
+        <w:numPr>
+          <w:ilvl w:val="0"/>
+          <w:numId w:val="1011"/>
+        </w:numPr>
+      </w:pPr>
+      <w:r>
+        <w:rPr>
+          <w:b/>
+          <w:bCs/>
+        </w:rPr>
+        <w:t xml:space="preserve">Monitor</w:t>
+      </w:r>
+      <w:r>
+        <w:t xml:space="preserve"> </w:t>
+      </w:r>
+      <w:r>
+        <w:t xml:space="preserve">— go to the Dashboard to watch throughput, or click the CP to see its live log</w:t>
+      </w:r>
+    </w:p>
+    <w:bookmarkEnd w:id="35"/>
+    <w:bookmarkStart w:id="36" w:name="message-pipeline-end-to-end"/>
+    <w:p>
+      <w:pPr>
+        <w:pStyle w:val="Heading3"/>
+      </w:pPr>
+      <w:r>
+        <w:t xml:space="preserve">Message Pipeline (End-to-End)</w:t>
+      </w:r>
+    </w:p>
+    <w:p>
+      <w:pPr>
+        <w:pStyle w:val="SourceCode"/>
+      </w:pPr>
+      <w:r>
+        <w:rPr>
+          <w:rStyle w:val="VerbatimChar"/>
+        </w:rPr>
+        <w:t xml:space="preserve">Hospital System → MLLP :2575 → [Ingestion] → NATS arteria.ingest.raw</w:t>
+      </w:r>
+      <w:r>
+        <w:br/>
+      </w:r>
+      <w:r>
+        <w:rPr>
+          <w:rStyle w:val="VerbatimChar"/>
+        </w:rPr>
+        <w:t xml:space="preserve">                                                         │</w:t>
+      </w:r>
+      <w:r>
+        <w:br/>
+      </w:r>
+      <w:r>
+        <w:rPr>
+          <w:rStyle w:val="VerbatimChar"/>
+        </w:rPr>
+        <w:t xml:space="preserve">                                                         ▼</w:t>
+      </w:r>
+      <w:r>
+        <w:br/>
+      </w:r>
+      <w:r>
+        <w:rPr>
+          <w:rStyle w:val="VerbatimChar"/>
+        </w:rPr>
+        <w:t xml:space="preserve">                                              [Processing + V8 Filters]</w:t>
+      </w:r>
+      <w:r>
+        <w:br/>
+      </w:r>
+      <w:r>
+        <w:rPr>
+          <w:rStyle w:val="VerbatimChar"/>
+        </w:rPr>
+        <w:t xml:space="preserve">                                                         │</w:t>
+      </w:r>
+      <w:r>
+        <w:br/>
+      </w:r>
+      <w:r>
+        <w:rPr>
+          <w:rStyle w:val="VerbatimChar"/>
+        </w:rPr>
+        <w:t xml:space="preserve">                                                         ▼</w:t>
+      </w:r>
+      <w:r>
+        <w:br/>
+      </w:r>
+      <w:r>
+        <w:rPr>
+          <w:rStyle w:val="VerbatimChar"/>
+        </w:rPr>
+        <w:t xml:space="preserve">                                              NATS arteria.route.&lt;topic&gt;</w:t>
+      </w:r>
+      <w:r>
+        <w:br/>
+      </w:r>
+      <w:r>
+        <w:rPr>
+          <w:rStyle w:val="VerbatimChar"/>
+        </w:rPr>
+        <w:t xml:space="preserve">                                                         │</w:t>
+      </w:r>
+      <w:r>
+        <w:br/>
+      </w:r>
+      <w:r>
+        <w:rPr>
+          <w:rStyle w:val="VerbatimChar"/>
+        </w:rPr>
+        <w:t xml:space="preserve">                                                         ▼</w:t>
+      </w:r>
+      <w:r>
+        <w:br/>
+      </w:r>
+      <w:r>
+        <w:rPr>
+          <w:rStyle w:val="VerbatimChar"/>
+        </w:rPr>
+        <w:t xml:space="preserve">                                                [Egress Service]</w:t>
+      </w:r>
+      <w:r>
+        <w:br/>
+      </w:r>
+      <w:r>
+        <w:rPr>
+          <w:rStyle w:val="VerbatimChar"/>
+        </w:rPr>
+        <w:t xml:space="preserve">                                                    │         │</w:t>
+      </w:r>
+      <w:r>
+        <w:br/>
+      </w:r>
+      <w:r>
+        <w:rPr>
+          <w:rStyle w:val="VerbatimChar"/>
+        </w:rPr>
+        <w:t xml:space="preserve">                                           ┌────────┘         └────────┐</w:t>
+      </w:r>
+      <w:r>
+        <w:br/>
+      </w:r>
+      <w:r>
+        <w:rPr>
+          <w:rStyle w:val="VerbatimChar"/>
+        </w:rPr>
+        <w:t xml:space="preserve">                                           ▼                           ▼</w:t>
+      </w:r>
+      <w:r>
+        <w:br/>
+      </w:r>
+      <w:r>
+        <w:rPr>
+          <w:rStyle w:val="VerbatimChar"/>
+        </w:rPr>
+        <w:t xml:space="preserve">                                    OUTPUT CP (MLLP)           OUTPUT CP (HTTP)</w:t>
+      </w:r>
+      <w:r>
+        <w:br/>
+      </w:r>
+      <w:r>
+        <w:rPr>
+          <w:rStyle w:val="VerbatimChar"/>
+        </w:rPr>
+        <w:t xml:space="preserve">                                    Lab System :2576           EMR Webhook</w:t>
+      </w:r>
+    </w:p>
+    <w:bookmarkEnd w:id="36"/>
+    <w:bookmarkStart w:id="37" w:name="debugging-a-failed-message"/>
+    <w:p>
+      <w:pPr>
+        <w:pStyle w:val="Heading3"/>
+      </w:pPr>
+      <w:r>
+        <w:t xml:space="preserve">Debugging a Failed Message</w:t>
+      </w:r>
+    </w:p>
+    <w:p>
+      <w:pPr>
+        <w:pStyle w:val="Compact"/>
+        <w:numPr>
+          <w:ilvl w:val="0"/>
+          <w:numId w:val="1016"/>
+        </w:numPr>
+      </w:pPr>
+      <w:r>
+        <w:t xml:space="preserve">Go to</w:t>
+      </w:r>
+      <w:r>
+        <w:t xml:space="preserve"> </w:t>
+      </w:r>
+      <w:r>
+        <w:rPr>
+          <w:b/>
+          <w:bCs/>
+        </w:rPr>
+        <w:t xml:space="preserve">Errors / DLQ</w:t>
+      </w:r>
+      <w:r>
+        <w:t xml:space="preserve"> </w:t>
+      </w:r>
+      <w:r>
+        <w:t xml:space="preserve">— find the failed message</w:t>
+      </w:r>
+    </w:p>
+    <w:p>
+      <w:pPr>
+        <w:pStyle w:val="Compact"/>
+        <w:numPr>
+          <w:ilvl w:val="0"/>
+          <w:numId w:val="1016"/>
+        </w:numPr>
+      </w:pPr>
+      <w:r>
+        <w:t xml:space="preserve">Note the</w:t>
+      </w:r>
+      <w:r>
+        <w:t xml:space="preserve"> </w:t>
+      </w:r>
+      <w:r>
+        <w:rPr>
+          <w:b/>
+          <w:bCs/>
+        </w:rPr>
+        <w:t xml:space="preserve">Message ID</w:t>
+      </w:r>
+      <w:r>
+        <w:t xml:space="preserve"> </w:t>
+      </w:r>
+      <w:r>
+        <w:t xml:space="preserve">and</w:t>
+      </w:r>
+      <w:r>
+        <w:t xml:space="preserve"> </w:t>
+      </w:r>
+      <w:r>
+        <w:rPr>
+          <w:b/>
+          <w:bCs/>
+        </w:rPr>
+        <w:t xml:space="preserve">Error Details</w:t>
+      </w:r>
+    </w:p>
+    <w:p>
+      <w:pPr>
+        <w:pStyle w:val="Compact"/>
+        <w:numPr>
+          <w:ilvl w:val="0"/>
+          <w:numId w:val="1016"/>
+        </w:numPr>
+      </w:pPr>
+      <w:r>
+        <w:t xml:space="preserve">Go to</w:t>
+      </w:r>
+      <w:r>
+        <w:t xml:space="preserve"> </w:t>
+      </w:r>
+      <w:r>
+        <w:rPr>
+          <w:b/>
+          <w:bCs/>
+        </w:rPr>
+        <w:t xml:space="preserve">Messages</w:t>
+      </w:r>
+      <w:r>
+        <w:t xml:space="preserve"> </w:t>
+      </w:r>
+      <w:r>
+        <w:t xml:space="preserve">— search for the message by scanning the list</w:t>
+      </w:r>
+    </w:p>
+    <w:p>
+      <w:pPr>
+        <w:pStyle w:val="Compact"/>
+        <w:numPr>
+          <w:ilvl w:val="0"/>
+          <w:numId w:val="1016"/>
+        </w:numPr>
+      </w:pPr>
+      <w:r>
+        <w:t xml:space="preserve">Click the message to see the</w:t>
+      </w:r>
+      <w:r>
+        <w:t xml:space="preserve"> </w:t>
+      </w:r>
+      <w:r>
+        <w:rPr>
+          <w:b/>
+          <w:bCs/>
+        </w:rPr>
+        <w:t xml:space="preserve">Raw Payload</w:t>
+      </w:r>
+      <w:r>
+        <w:t xml:space="preserve"> </w:t>
+      </w:r>
+      <w:r>
+        <w:t xml:space="preserve">(what was received)</w:t>
+      </w:r>
+    </w:p>
+    <w:p>
+      <w:pPr>
+        <w:pStyle w:val="Compact"/>
+        <w:numPr>
+          <w:ilvl w:val="0"/>
+          <w:numId w:val="1016"/>
+        </w:numPr>
+      </w:pPr>
+      <w:r>
+        <w:t xml:space="preserve">Check the error: was it a filter rejection? A timeout? A validation failure?</w:t>
+      </w:r>
+    </w:p>
+    <w:p>
+      <w:pPr>
+        <w:pStyle w:val="Compact"/>
+        <w:numPr>
+          <w:ilvl w:val="0"/>
+          <w:numId w:val="1016"/>
+        </w:numPr>
+      </w:pPr>
+      <w:r>
+        <w:t xml:space="preserve">Go to</w:t>
+      </w:r>
+      <w:r>
+        <w:t xml:space="preserve"> </w:t>
+      </w:r>
+      <w:r>
+        <w:rPr>
+          <w:b/>
+          <w:bCs/>
+        </w:rPr>
+        <w:t xml:space="preserve">Routes</w:t>
+      </w:r>
+      <w:r>
+        <w:t xml:space="preserve"> </w:t>
+      </w:r>
+      <w:r>
+        <w:t xml:space="preserve">— open the route and check the filter chain</w:t>
+      </w:r>
+    </w:p>
+    <w:p>
+      <w:pPr>
+        <w:pStyle w:val="Compact"/>
+        <w:numPr>
+          <w:ilvl w:val="0"/>
+          <w:numId w:val="1016"/>
+        </w:numPr>
+      </w:pPr>
+      <w:r>
+        <w:t xml:space="preserve">Edit the filter script if needed, click</w:t>
+      </w:r>
+      <w:r>
+        <w:t xml:space="preserve"> </w:t>
+      </w:r>
+      <w:r>
+        <w:rPr>
+          <w:b/>
+          <w:bCs/>
+        </w:rPr>
+        <w:t xml:space="preserve">Save Filter</w:t>
+      </w:r>
+    </w:p>
+    <w:p>
+      <w:pPr>
+        <w:pStyle w:val="Compact"/>
+        <w:numPr>
+          <w:ilvl w:val="0"/>
+          <w:numId w:val="1016"/>
+        </w:numPr>
+      </w:pPr>
+      <w:r>
+        <w:t xml:space="preserve">The processing service reloads routes every 30 seconds — or restart it to apply immediately</w:t>
+      </w:r>
+    </w:p>
+    <w:bookmarkEnd w:id="37"/>
+    <w:bookmarkStart w:id="38" w:name="monitoring-throughput"/>
+    <w:p>
+      <w:pPr>
+        <w:pStyle w:val="Heading3"/>
+      </w:pPr>
+      <w:r>
+        <w:t xml:space="preserve">Monitoring Throughput</w:t>
+      </w:r>
+    </w:p>
+    <w:p>
+      <w:pPr>
+        <w:pStyle w:val="Compact"/>
+        <w:numPr>
+          <w:ilvl w:val="0"/>
+          <w:numId w:val="1017"/>
+        </w:numPr>
+      </w:pPr>
+      <w:r>
+        <w:t xml:space="preserve">Go to</w:t>
+      </w:r>
+      <w:r>
+        <w:t xml:space="preserve"> </w:t>
+      </w:r>
+      <w:r>
+        <w:rPr>
+          <w:b/>
+          <w:bCs/>
+        </w:rPr>
+        <w:t xml:space="preserve">Dashboard</w:t>
+      </w:r>
+      <w:r>
+        <w:t xml:space="preserve"> </w:t>
+      </w:r>
+      <w:r>
+        <w:t xml:space="preserve">— the live metrics panels update every 3 seconds</w:t>
+      </w:r>
+    </w:p>
+    <w:p>
+      <w:pPr>
+        <w:pStyle w:val="Compact"/>
+        <w:numPr>
+          <w:ilvl w:val="0"/>
+          <w:numId w:val="1017"/>
+        </w:numPr>
+      </w:pPr>
+      <w:r>
+        <w:t xml:space="preserve">Check</w:t>
+      </w:r>
+      <w:r>
+        <w:t xml:space="preserve"> </w:t>
+      </w:r>
+      <w:r>
+        <w:rPr>
+          <w:b/>
+          <w:bCs/>
+        </w:rPr>
+        <w:t xml:space="preserve">msgs/min</w:t>
+      </w:r>
+      <w:r>
+        <w:t xml:space="preserve"> </w:t>
+      </w:r>
+      <w:r>
+        <w:t xml:space="preserve">on both ingestion and processing</w:t>
+      </w:r>
+    </w:p>
+    <w:p>
+      <w:pPr>
+        <w:pStyle w:val="Compact"/>
+        <w:numPr>
+          <w:ilvl w:val="0"/>
+          <w:numId w:val="1017"/>
+        </w:numPr>
+      </w:pPr>
+      <w:r>
+        <w:t xml:space="preserve">If processing is slower than ingestion, messages are queuing in NATS</w:t>
+      </w:r>
+    </w:p>
+    <w:p>
+      <w:pPr>
+        <w:pStyle w:val="Compact"/>
+        <w:numPr>
+          <w:ilvl w:val="0"/>
+          <w:numId w:val="1017"/>
+        </w:numPr>
+      </w:pPr>
+      <w:r>
+        <w:t xml:space="preserve">Click a</w:t>
+      </w:r>
+      <w:r>
+        <w:t xml:space="preserve"> </w:t>
+      </w:r>
+      <w:r>
+        <w:rPr>
+          <w:b/>
+          <w:bCs/>
+        </w:rPr>
+        <w:t xml:space="preserve">Comm Point</w:t>
+      </w:r>
+      <w:r>
+        <w:t xml:space="preserve"> </w:t>
+      </w:r>
+      <w:r>
+        <w:t xml:space="preserve">to see per-CP received/error counts and live logs</w:t>
+      </w:r>
+    </w:p>
+    <w:bookmarkEnd w:id="38"/>
+    <w:bookmarkStart w:id="39" w:name="changing-log-verbosity-at-runtime"/>
+    <w:p>
+      <w:pPr>
+        <w:pStyle w:val="Heading3"/>
+      </w:pPr>
+      <w:r>
+        <w:t xml:space="preserve">Changing Log Verbosity at Runtime</w:t>
+      </w:r>
+    </w:p>
+    <w:p>
+      <w:pPr>
+        <w:pStyle w:val="FirstParagraph"/>
+      </w:pPr>
+      <w:r>
+        <w:t xml:space="preserve">You can reduce log noise without restarting:</w:t>
+      </w:r>
+    </w:p>
+    <w:p>
+      <w:pPr>
+        <w:numPr>
+          <w:ilvl w:val="0"/>
+          <w:numId w:val="1018"/>
+        </w:numPr>
+      </w:pPr>
+      <w:r>
+        <w:t xml:space="preserve">Use the API (there is no UI toggle yet):</w:t>
+      </w:r>
+    </w:p>
+    <w:p>
+      <w:pPr>
+        <w:pStyle w:val="SourceCode"/>
+        <w:numPr>
+          <w:ilvl w:val="0"/>
+          <w:numId w:val="1000"/>
+        </w:numPr>
+      </w:pPr>
+      <w:r>
+        <w:rPr>
           <w:rStyle w:val="CommentTok"/>
         </w:rPr>
         <w:t xml:space="preserve"># Set to WARN (reduces TRACE/DEBUG/INFO output)</w:t>
@@ -4468,9 +6966,9 @@
         </w:pict>
       </w:r>
     </w:p>
-    <w:bookmarkEnd w:id="29"/>
-    <w:bookmarkEnd w:id="30"/>
-    <w:bookmarkStart w:id="31" w:name="keyboard-interaction-reference"/>
+    <w:bookmarkEnd w:id="39"/>
+    <w:bookmarkEnd w:id="40"/>
+    <w:bookmarkStart w:id="41" w:name="keyboard-interaction-reference"/>
     <w:p>
       <w:pPr>
         <w:pStyle w:val="Heading2"/>
@@ -4717,8 +7215,8 @@
         </w:pict>
       </w:r>
     </w:p>
-    <w:bookmarkEnd w:id="31"/>
-    <w:bookmarkStart w:id="32" w:name="message-object-reference-for-js-filters"/>
+    <w:bookmarkEnd w:id="41"/>
+    <w:bookmarkStart w:id="42" w:name="message-object-reference-for-js-filters"/>
     <w:p>
       <w:pPr>
         <w:pStyle w:val="Heading2"/>
@@ -5190,7 +7688,7 @@
         <w:t xml:space="preserve"> </w:t>
       </w:r>
       <w:r>
-        <w:t xml:space="preserve">must return the modified message object</w:t>
+        <w:t xml:space="preserve">must return the modified message object (JavaScript V8 filters)</w:t>
       </w:r>
       <w:r>
         <w:t xml:space="preserve"> </w:t>
@@ -5250,19 +7748,49 @@
         <w:t xml:space="preserve"> </w:t>
       </w:r>
       <w:r>
-        <w:t xml:space="preserve">- Scripts have a 50ms execution timeout</w:t>
-      </w:r>
-      <w:r>
-        <w:t xml:space="preserve"> </w:t>
-      </w:r>
-      <w:r>
-        <w:t xml:space="preserve">- Scripts cannot access the network, filesystem, or external APIs</w:t>
-      </w:r>
-      <w:r>
-        <w:t xml:space="preserve"> </w:t>
-      </w:r>
-      <w:r>
-        <w:t xml:space="preserve">- Properties are string key-value pairs only</w:t>
+        <w:t xml:space="preserve">(JavaScript V8 conditional filters)</w:t>
+      </w:r>
+      <w:r>
+        <w:t xml:space="preserve"> </w:t>
+      </w:r>
+      <w:r>
+        <w:t xml:space="preserve">- Python/bash/dotnet filters read the envelope JSON from stdin and write modified JSON to stdout</w:t>
+      </w:r>
+      <w:r>
+        <w:t xml:space="preserve"> </w:t>
+      </w:r>
+      <w:r>
+        <w:t xml:space="preserve">- Connector filters make outbound HTTP/MLLP calls and store responses in properties</w:t>
+      </w:r>
+      <w:r>
+        <w:t xml:space="preserve"> </w:t>
+      </w:r>
+      <w:r>
+        <w:t xml:space="preserve">- JavaScript filters have a 50ms timeout; Python/bash have 2s; dotnet has 10s</w:t>
+      </w:r>
+      <w:r>
+        <w:t xml:space="preserve"> </w:t>
+      </w:r>
+      <w:r>
+        <w:t xml:space="preserve">- JavaScript V8 filters cannot access the network, filesystem, or external APIs</w:t>
+      </w:r>
+      <w:r>
+        <w:t xml:space="preserve"> </w:t>
+      </w:r>
+      <w:r>
+        <w:t xml:space="preserve">- Python/bash/dotnet filters run as subprocesses with full system access (within the container)</w:t>
+      </w:r>
+      <w:r>
+        <w:t xml:space="preserve"> </w:t>
+      </w:r>
+      <w:r>
+        <w:t xml:space="preserve">- Properties are string key-value pairs that persist through the entire filter chain</w:t>
+      </w:r>
+      <w:r>
+        <w:t xml:space="preserve"> </w:t>
+      </w:r>
+      <w:r>
+        <w:t xml:space="preserve">- Route default properties are injected before the first filter runs</w:t>
       </w:r>
     </w:p>
     <w:p>
@@ -5272,8 +7800,8 @@
         </w:pict>
       </w:r>
     </w:p>
-    <w:bookmarkEnd w:id="32"/>
-    <w:bookmarkStart w:id="36" w:name="settings"/>
+    <w:bookmarkEnd w:id="42"/>
+    <w:bookmarkStart w:id="46" w:name="settings"/>
     <w:p>
       <w:pPr>
         <w:pStyle w:val="Heading2"/>
@@ -5303,7 +7831,7 @@
         <w:t xml:space="preserve">/settings</w:t>
       </w:r>
     </w:p>
-    <w:bookmarkStart w:id="33" w:name="message-retention"/>
+    <w:bookmarkStart w:id="43" w:name="message-retention"/>
     <w:p>
       <w:pPr>
         <w:pStyle w:val="Heading3"/>
@@ -5386,8 +7914,8 @@
         <w:t xml:space="preserve">to apply</w:t>
       </w:r>
     </w:p>
-    <w:bookmarkEnd w:id="33"/>
-    <w:bookmarkStart w:id="34" w:name="configuration-backups"/>
+    <w:bookmarkEnd w:id="43"/>
+    <w:bookmarkStart w:id="44" w:name="configuration-backups"/>
     <w:p>
       <w:pPr>
         <w:pStyle w:val="Heading3"/>
@@ -5401,7 +7929,7 @@
         <w:pStyle w:val="Compact"/>
         <w:numPr>
           <w:ilvl w:val="0"/>
-          <w:numId w:val="1016"/>
+          <w:numId w:val="1019"/>
         </w:numPr>
       </w:pPr>
       <w:r>
@@ -5423,7 +7951,7 @@
         <w:pStyle w:val="Compact"/>
         <w:numPr>
           <w:ilvl w:val="0"/>
-          <w:numId w:val="1016"/>
+          <w:numId w:val="1019"/>
         </w:numPr>
       </w:pPr>
       <w:r>
@@ -5460,7 +7988,7 @@
         <w:pStyle w:val="Compact"/>
         <w:numPr>
           <w:ilvl w:val="0"/>
-          <w:numId w:val="1016"/>
+          <w:numId w:val="1019"/>
         </w:numPr>
       </w:pPr>
       <w:r>
@@ -5482,15 +8010,15 @@
         <w:pStyle w:val="Compact"/>
         <w:numPr>
           <w:ilvl w:val="0"/>
-          <w:numId w:val="1016"/>
+          <w:numId w:val="1019"/>
         </w:numPr>
       </w:pPr>
       <w:r>
         <w:t xml:space="preserve">Auto-backup runs every 6 hours</w:t>
       </w:r>
     </w:p>
-    <w:bookmarkEnd w:id="34"/>
-    <w:bookmarkStart w:id="35" w:name="system-health-check"/>
+    <w:bookmarkEnd w:id="44"/>
+    <w:bookmarkStart w:id="45" w:name="system-health-check"/>
     <w:p>
       <w:pPr>
         <w:pStyle w:val="Heading3"/>
@@ -5566,9 +8094,9 @@
         </w:pict>
       </w:r>
     </w:p>
-    <w:bookmarkEnd w:id="35"/>
-    <w:bookmarkEnd w:id="36"/>
-    <w:bookmarkStart w:id="39" w:name="users-access-control"/>
+    <w:bookmarkEnd w:id="45"/>
+    <w:bookmarkEnd w:id="46"/>
+    <w:bookmarkStart w:id="49" w:name="users-access-control"/>
     <w:p>
       <w:pPr>
         <w:pStyle w:val="Heading2"/>
@@ -5604,7 +8132,7 @@
         <w:t xml:space="preserve">(visible to admin and security roles only)</w:t>
       </w:r>
     </w:p>
-    <w:bookmarkStart w:id="37" w:name="managing-users"/>
+    <w:bookmarkStart w:id="47" w:name="managing-users"/>
     <w:p>
       <w:pPr>
         <w:pStyle w:val="Heading3"/>
@@ -5618,7 +8146,7 @@
         <w:pStyle w:val="Compact"/>
         <w:numPr>
           <w:ilvl w:val="0"/>
-          <w:numId w:val="1017"/>
+          <w:numId w:val="1020"/>
         </w:numPr>
       </w:pPr>
       <w:r>
@@ -5646,7 +8174,7 @@
         <w:pStyle w:val="Compact"/>
         <w:numPr>
           <w:ilvl w:val="0"/>
-          <w:numId w:val="1017"/>
+          <w:numId w:val="1020"/>
         </w:numPr>
       </w:pPr>
       <w:r>
@@ -5668,7 +8196,7 @@
         <w:pStyle w:val="Compact"/>
         <w:numPr>
           <w:ilvl w:val="0"/>
-          <w:numId w:val="1017"/>
+          <w:numId w:val="1020"/>
         </w:numPr>
       </w:pPr>
       <w:r>
@@ -5690,7 +8218,7 @@
         <w:pStyle w:val="Compact"/>
         <w:numPr>
           <w:ilvl w:val="0"/>
-          <w:numId w:val="1017"/>
+          <w:numId w:val="1020"/>
         </w:numPr>
       </w:pPr>
       <w:r>
@@ -5707,8 +8235,8 @@
         <w:t xml:space="preserve">— click Delete on the user row</w:t>
       </w:r>
     </w:p>
-    <w:bookmarkEnd w:id="37"/>
-    <w:bookmarkStart w:id="38" w:name="roles-reference"/>
+    <w:bookmarkEnd w:id="47"/>
+    <w:bookmarkStart w:id="48" w:name="roles-reference"/>
     <w:p>
       <w:pPr>
         <w:pStyle w:val="Heading3"/>
@@ -5911,9 +8439,9 @@
         </w:pict>
       </w:r>
     </w:p>
-    <w:bookmarkEnd w:id="38"/>
-    <w:bookmarkEnd w:id="39"/>
-    <w:bookmarkStart w:id="40" w:name="cloud-connector-configuration"/>
+    <w:bookmarkEnd w:id="48"/>
+    <w:bookmarkEnd w:id="49"/>
+    <w:bookmarkStart w:id="50" w:name="cloud-connector-configuration"/>
     <w:p>
       <w:pPr>
         <w:pStyle w:val="Heading2"/>
@@ -6048,14 +8576,14 @@
         </w:pict>
       </w:r>
     </w:p>
-    <w:bookmarkEnd w:id="40"/>
-    <w:bookmarkStart w:id="44" w:name="tunnel-mesh"/>
+    <w:bookmarkEnd w:id="50"/>
+    <w:bookmarkStart w:id="53" w:name="aorta-mesh"/>
     <w:p>
       <w:pPr>
         <w:pStyle w:val="Heading2"/>
       </w:pPr>
       <w:r>
-        <w:t xml:space="preserve">12. Tunnel Mesh</w:t>
+        <w:t xml:space="preserve">12. Aorta Mesh</w:t>
       </w:r>
     </w:p>
     <w:p>
@@ -6079,20 +8607,20 @@
         <w:t xml:space="preserve">/tunnel</w:t>
       </w:r>
     </w:p>
-    <w:bookmarkStart w:id="41" w:name="creating-a-tunnel-node"/>
+    <w:bookmarkStart w:id="51" w:name="creating-a-capillary-node"/>
     <w:p>
       <w:pPr>
         <w:pStyle w:val="Heading3"/>
       </w:pPr>
       <w:r>
-        <w:t xml:space="preserve">Creating a Tunnel Node</w:t>
+        <w:t xml:space="preserve">Creating a Capillary Node</w:t>
       </w:r>
     </w:p>
     <w:p>
       <w:pPr>
         <w:numPr>
           <w:ilvl w:val="0"/>
-          <w:numId w:val="1018"/>
+          <w:numId w:val="1021"/>
         </w:numPr>
       </w:pPr>
       <w:r>
@@ -6106,7 +8634,7 @@
           <w:b/>
           <w:bCs/>
         </w:rPr>
-        <w:t xml:space="preserve">+ New Tunnel Node</w:t>
+        <w:t xml:space="preserve">+ New Capillary Node</w:t>
       </w:r>
       <w:r>
         <w:t xml:space="preserve"> </w:t>
@@ -6119,7 +8647,7 @@
       <w:pPr>
         <w:numPr>
           <w:ilvl w:val="0"/>
-          <w:numId w:val="1018"/>
+          <w:numId w:val="1021"/>
         </w:numPr>
       </w:pPr>
       <w:r>
@@ -6130,11 +8658,11 @@
       <w:pPr>
         <w:numPr>
           <w:ilvl w:val="0"/>
-          <w:numId w:val="1018"/>
+          <w:numId w:val="1021"/>
         </w:numPr>
       </w:pPr>
       <w:r>
-        <w:t xml:space="preserve">Deploy the agent Docker image at the remote site:</w:t>
+        <w:t xml:space="preserve">Deploy the Capillary agent at the remote site (binary or Docker):</w:t>
       </w:r>
     </w:p>
     <w:p>
@@ -6147,6 +8675,93 @@
       </w:pPr>
       <w:r>
         <w:rPr>
+          <w:rStyle w:val="CommentTok"/>
+        </w:rPr>
+        <w:t xml:space="preserve"># Option A: Standalone binary (recommended)</w:t>
+      </w:r>
+      <w:r>
+        <w:br/>
+      </w:r>
+      <w:r>
+        <w:rPr>
+          <w:rStyle w:val="ExtensionTok"/>
+        </w:rPr>
+        <w:t xml:space="preserve">./capillary</w:t>
+      </w:r>
+      <w:r>
+        <w:rPr>
+          <w:rStyle w:val="NormalTok"/>
+        </w:rPr>
+        <w:t xml:space="preserve"> enroll </w:t>
+      </w:r>
+      <w:r>
+        <w:rPr>
+          <w:rStyle w:val="OperatorTok"/>
+        </w:rPr>
+        <w:t xml:space="preserve">&lt;</w:t>
+      </w:r>
+      <w:r>
+        <w:rPr>
+          <w:rStyle w:val="NormalTok"/>
+        </w:rPr>
+        <w:t xml:space="preserve">token</w:t>
+      </w:r>
+      <w:r>
+        <w:rPr>
+          <w:rStyle w:val="OperatorTok"/>
+        </w:rPr>
+        <w:t xml:space="preserve">&gt;</w:t>
+      </w:r>
+      <w:r>
+        <w:rPr>
+          <w:rStyle w:val="NormalTok"/>
+        </w:rPr>
+        <w:t xml:space="preserve"> --broker arteria.software:9443</w:t>
+      </w:r>
+      <w:r>
+        <w:br/>
+      </w:r>
+      <w:r>
+        <w:rPr>
+          <w:rStyle w:val="ExtensionTok"/>
+        </w:rPr>
+        <w:t xml:space="preserve">./capillary</w:t>
+      </w:r>
+      <w:r>
+        <w:rPr>
+          <w:rStyle w:val="NormalTok"/>
+        </w:rPr>
+        <w:t xml:space="preserve"> connect </w:t>
+      </w:r>
+      <w:r>
+        <w:rPr>
+          <w:rStyle w:val="AttributeTok"/>
+        </w:rPr>
+        <w:t xml:space="preserve">--broker</w:t>
+      </w:r>
+      <w:r>
+        <w:rPr>
+          <w:rStyle w:val="NormalTok"/>
+        </w:rPr>
+        <w:t xml:space="preserve"> arteria.software:9443</w:t>
+      </w:r>
+      <w:r>
+        <w:br/>
+      </w:r>
+      <w:r>
+        <w:br/>
+      </w:r>
+      <w:r>
+        <w:rPr>
+          <w:rStyle w:val="CommentTok"/>
+        </w:rPr>
+        <w:t xml:space="preserve"># Option B: Docker</w:t>
+      </w:r>
+      <w:r>
+        <w:br/>
+      </w:r>
+      <w:r>
+        <w:rPr>
           <w:rStyle w:val="ExtensionTok"/>
         </w:rPr>
         <w:t xml:space="preserve">docker</w:t>
@@ -6297,21 +8912,21 @@
       <w:pPr>
         <w:numPr>
           <w:ilvl w:val="0"/>
-          <w:numId w:val="1018"/>
+          <w:numId w:val="1021"/>
         </w:numPr>
       </w:pPr>
       <w:r>
         <w:t xml:space="preserve">The node status changes from PENDING → ENROLLED → CONNECTED</w:t>
       </w:r>
     </w:p>
-    <w:bookmarkEnd w:id="41"/>
-    <w:bookmarkStart w:id="42" w:name="linking-cps-to-tunnel-nodes"/>
+    <w:bookmarkEnd w:id="51"/>
+    <w:bookmarkStart w:id="52" w:name="linking-cps-to-capillary-nodes"/>
     <w:p>
       <w:pPr>
         <w:pStyle w:val="Heading3"/>
       </w:pPr>
       <w:r>
-        <w:t xml:space="preserve">Linking CPs to Tunnel Nodes</w:t>
+        <w:t xml:space="preserve">Linking CPs to Capillary Nodes</w:t>
       </w:r>
     </w:p>
     <w:p>
@@ -6319,7 +8934,7 @@
         <w:pStyle w:val="Compact"/>
         <w:numPr>
           <w:ilvl w:val="0"/>
-          <w:numId w:val="1019"/>
+          <w:numId w:val="1022"/>
         </w:numPr>
       </w:pPr>
       <w:r>
@@ -6349,7 +8964,7 @@
           <w:b/>
           <w:bCs/>
         </w:rPr>
-        <w:t xml:space="preserve">Enable Encrypted Tunnel</w:t>
+        <w:t xml:space="preserve">Route via Capillary</w:t>
       </w:r>
     </w:p>
     <w:p>
@@ -6357,11 +8972,11 @@
         <w:pStyle w:val="Compact"/>
         <w:numPr>
           <w:ilvl w:val="0"/>
-          <w:numId w:val="1019"/>
+          <w:numId w:val="1022"/>
         </w:numPr>
       </w:pPr>
       <w:r>
-        <w:t xml:space="preserve">Select the tunnel node from the dropdown</w:t>
+        <w:t xml:space="preserve">Select the Capillary node from the dropdown</w:t>
       </w:r>
     </w:p>
     <w:p>
@@ -6369,7 +8984,7 @@
         <w:pStyle w:val="Compact"/>
         <w:numPr>
           <w:ilvl w:val="0"/>
-          <w:numId w:val="1019"/>
+          <w:numId w:val="1022"/>
         </w:numPr>
       </w:pPr>
       <w:r>
@@ -6381,7 +8996,7 @@
         <w:pStyle w:val="Compact"/>
         <w:numPr>
           <w:ilvl w:val="0"/>
-          <w:numId w:val="1019"/>
+          <w:numId w:val="1022"/>
         </w:numPr>
       </w:pPr>
       <w:r>
@@ -6393,78 +9008,16 @@
         <w:pStyle w:val="Compact"/>
         <w:numPr>
           <w:ilvl w:val="0"/>
-          <w:numId w:val="1019"/>
+          <w:numId w:val="1022"/>
         </w:numPr>
       </w:pPr>
       <w:r>
-        <w:t xml:space="preserve">The agent starts listening and all traffic flows encrypted</w:t>
-      </w:r>
-    </w:p>
-    <w:bookmarkEnd w:id="42"/>
-    <w:bookmarkStart w:id="43" w:name="port-management"/>
-    <w:p>
-      <w:pPr>
-        <w:pStyle w:val="Heading3"/>
-      </w:pPr>
-      <w:r>
-        <w:t xml:space="preserve">Port Management</w:t>
-      </w:r>
-    </w:p>
-    <w:p>
-      <w:pPr>
-        <w:pStyle w:val="FirstParagraph"/>
-      </w:pPr>
-      <w:r>
-        <w:t xml:space="preserve">On the agent host:</w:t>
-      </w:r>
-    </w:p>
-    <w:p>
-      <w:pPr>
-        <w:pStyle w:val="SourceCode"/>
-      </w:pPr>
-      <w:r>
-        <w:rPr>
-          <w:rStyle w:val="ExtensionTok"/>
-        </w:rPr>
-        <w:t xml:space="preserve">./agent-ports.sh</w:t>
-      </w:r>
-      <w:r>
-        <w:rPr>
-          <w:rStyle w:val="NormalTok"/>
-        </w:rPr>
-        <w:t xml:space="preserve"> add 2579 2580     </w:t>
-      </w:r>
-      <w:r>
-        <w:rPr>
-          <w:rStyle w:val="CommentTok"/>
-        </w:rPr>
-        <w:t xml:space="preserve"># Add new ports</w:t>
-      </w:r>
-      <w:r>
-        <w:br/>
-      </w:r>
-      <w:r>
-        <w:rPr>
-          <w:rStyle w:val="ExtensionTok"/>
-        </w:rPr>
-        <w:t xml:space="preserve">./agent-ports.sh</w:t>
-      </w:r>
-      <w:r>
-        <w:rPr>
-          <w:rStyle w:val="NormalTok"/>
-        </w:rPr>
-        <w:t xml:space="preserve"> restart           </w:t>
-      </w:r>
-      <w:r>
-        <w:rPr>
-          <w:rStyle w:val="CommentTok"/>
-        </w:rPr>
-        <w:t xml:space="preserve"># Recreate container</w:t>
-      </w:r>
-    </w:p>
-    <w:bookmarkEnd w:id="43"/>
-    <w:bookmarkEnd w:id="44"/>
-    <w:bookmarkEnd w:id="45"/>
+        <w:t xml:space="preserve">The agent starts listening and all traffic flows encrypted through the Aorta mesh</w:t>
+      </w:r>
+    </w:p>
+    <w:bookmarkEnd w:id="52"/>
+    <w:bookmarkEnd w:id="53"/>
+    <w:bookmarkEnd w:id="54"/>
     <w:sectPr>
       <w:footnotePr>
         <w:numRestart w:val="eachSect"/>
@@ -6839,9 +9392,6 @@
     </w:lvlOverride>
   </w:num>
   <w:num w:numId="1007">
-    <w:abstractNumId w:val="991"/>
-  </w:num>
-  <w:num w:numId="1008">
     <w:abstractNumId w:val="99411"/>
     <w:lvlOverride w:ilvl="0">
       <w:startOverride w:val="1"/>
@@ -6871,6 +9421,9 @@
       <w:startOverride w:val="1"/>
     </w:lvlOverride>
   </w:num>
+  <w:num w:numId="1008">
+    <w:abstractNumId w:val="991"/>
+  </w:num>
   <w:num w:numId="1009">
     <w:abstractNumId w:val="991"/>
   </w:num>
@@ -6878,12 +9431,6 @@
     <w:abstractNumId w:val="991"/>
   </w:num>
   <w:num w:numId="1011">
-    <w:abstractNumId w:val="991"/>
-  </w:num>
-  <w:num w:numId="1012">
-    <w:abstractNumId w:val="991"/>
-  </w:num>
-  <w:num w:numId="1013">
     <w:abstractNumId w:val="99411"/>
     <w:lvlOverride w:ilvl="0">
       <w:startOverride w:val="1"/>
@@ -6913,7 +9460,19 @@
       <w:startOverride w:val="1"/>
     </w:lvlOverride>
   </w:num>
+  <w:num w:numId="1012">
+    <w:abstractNumId w:val="991"/>
+  </w:num>
+  <w:num w:numId="1013">
+    <w:abstractNumId w:val="991"/>
+  </w:num>
   <w:num w:numId="1014">
+    <w:abstractNumId w:val="991"/>
+  </w:num>
+  <w:num w:numId="1015">
+    <w:abstractNumId w:val="991"/>
+  </w:num>
+  <w:num w:numId="1016">
     <w:abstractNumId w:val="99411"/>
     <w:lvlOverride w:ilvl="0">
       <w:startOverride w:val="1"/>
@@ -6943,7 +9502,7 @@
       <w:startOverride w:val="1"/>
     </w:lvlOverride>
   </w:num>
-  <w:num w:numId="1015">
+  <w:num w:numId="1017">
     <w:abstractNumId w:val="99411"/>
     <w:lvlOverride w:ilvl="0">
       <w:startOverride w:val="1"/>
@@ -6972,12 +9531,6 @@
     <w:lvlOverride w:ilvl="8">
       <w:startOverride w:val="1"/>
     </w:lvlOverride>
-  </w:num>
-  <w:num w:numId="1016">
-    <w:abstractNumId w:val="991"/>
-  </w:num>
-  <w:num w:numId="1017">
-    <w:abstractNumId w:val="991"/>
   </w:num>
   <w:num w:numId="1018">
     <w:abstractNumId w:val="99411"/>
@@ -7010,6 +9563,42 @@
     </w:lvlOverride>
   </w:num>
   <w:num w:numId="1019">
+    <w:abstractNumId w:val="991"/>
+  </w:num>
+  <w:num w:numId="1020">
+    <w:abstractNumId w:val="991"/>
+  </w:num>
+  <w:num w:numId="1021">
+    <w:abstractNumId w:val="99411"/>
+    <w:lvlOverride w:ilvl="0">
+      <w:startOverride w:val="1"/>
+    </w:lvlOverride>
+    <w:lvlOverride w:ilvl="1">
+      <w:startOverride w:val="1"/>
+    </w:lvlOverride>
+    <w:lvlOverride w:ilvl="2">
+      <w:startOverride w:val="1"/>
+    </w:lvlOverride>
+    <w:lvlOverride w:ilvl="3">
+      <w:startOverride w:val="1"/>
+    </w:lvlOverride>
+    <w:lvlOverride w:ilvl="4">
+      <w:startOverride w:val="1"/>
+    </w:lvlOverride>
+    <w:lvlOverride w:ilvl="5">
+      <w:startOverride w:val="1"/>
+    </w:lvlOverride>
+    <w:lvlOverride w:ilvl="6">
+      <w:startOverride w:val="1"/>
+    </w:lvlOverride>
+    <w:lvlOverride w:ilvl="7">
+      <w:startOverride w:val="1"/>
+    </w:lvlOverride>
+    <w:lvlOverride w:ilvl="8">
+      <w:startOverride w:val="1"/>
+    </w:lvlOverride>
+  </w:num>
+  <w:num w:numId="1022">
     <w:abstractNumId w:val="99411"/>
     <w:lvlOverride w:ilvl="0">
       <w:startOverride w:val="1"/>

</xml_diff>